<commit_message>
fix: use intermediate variables for inline array access in NonCustomerController
</commit_message>
<xml_diff>
--- a/blueprint/DRAFT_Blueprint_ERP_Marketing_CWA.docx
+++ b/blueprint/DRAFT_Blueprint_ERP_Marketing_CWA.docx
@@ -7177,41 +7177,15 @@
           <w:szCs w:val="24"/>
           <w:lang w:val="en-US"/>
         </w:rPr>
-        <w:t xml:space="preserve">Dashboard </w:t>
-      </w:r>
-      <w:r>
-        <w:rPr>
-          <w:b/>
-          <w:bCs/>
-          <w:sz w:val="24"/>
-          <w:szCs w:val="24"/>
-          <w:lang w:val="en-US"/>
-        </w:rPr>
-        <w:t>Production Proses</w:t>
-      </w:r>
-      <w:r>
-        <w:rPr>
-          <w:sz w:val="24"/>
-          <w:szCs w:val="24"/>
-          <w:lang w:val="en-US"/>
-        </w:rPr>
-        <w:t xml:space="preserve"> `</w:t>
-      </w:r>
-      <w:r>
-        <w:rPr>
-          <w:sz w:val="24"/>
-          <w:szCs w:val="24"/>
-          <w:lang w:val="en-US"/>
-        </w:rPr>
-        <w:t>production-process-dashboard</w:t>
-      </w:r>
-      <w:r>
-        <w:rPr>
-          <w:sz w:val="24"/>
-          <w:szCs w:val="24"/>
-          <w:lang w:val="en-US"/>
-        </w:rPr>
-        <w:t>`</w:t>
+        <w:t xml:space="preserve">Dashboard Marketing </w:t>
+      </w:r>
+      <w:r>
+        <w:rPr>
+          <w:sz w:val="24"/>
+          <w:szCs w:val="24"/>
+          <w:lang w:val="en-US"/>
+        </w:rPr>
+        <w:t>`marketing-dashboard`</w:t>
       </w:r>
     </w:p>
     <w:p>
@@ -7258,6 +7232,142 @@
         </w:rPr>
         <w:t xml:space="preserve"> </w:t>
       </w:r>
+      <w:proofErr w:type="spellStart"/>
+      <w:r>
+        <w:rPr>
+          <w:sz w:val="24"/>
+          <w:szCs w:val="24"/>
+          <w:lang w:val="en-US"/>
+        </w:rPr>
+        <w:t>Total_Prospect_Non_Customer</w:t>
+      </w:r>
+      <w:proofErr w:type="spellEnd"/>
+      <w:r>
+        <w:rPr>
+          <w:sz w:val="24"/>
+          <w:szCs w:val="24"/>
+          <w:lang w:val="en-US"/>
+        </w:rPr>
+        <w:t xml:space="preserve">, </w:t>
+      </w:r>
+      <w:proofErr w:type="spellStart"/>
+      <w:r>
+        <w:rPr>
+          <w:sz w:val="24"/>
+          <w:szCs w:val="24"/>
+          <w:lang w:val="en-US"/>
+        </w:rPr>
+        <w:t>Total_Marketing_Visits_Today</w:t>
+      </w:r>
+      <w:proofErr w:type="spellEnd"/>
+      <w:r>
+        <w:rPr>
+          <w:sz w:val="24"/>
+          <w:szCs w:val="24"/>
+          <w:lang w:val="en-US"/>
+        </w:rPr>
+        <w:t xml:space="preserve">, </w:t>
+      </w:r>
+      <w:proofErr w:type="spellStart"/>
+      <w:r>
+        <w:rPr>
+          <w:sz w:val="24"/>
+          <w:szCs w:val="24"/>
+          <w:lang w:val="en-US"/>
+        </w:rPr>
+        <w:t>Total_NOO_This_Month</w:t>
+      </w:r>
+      <w:proofErr w:type="spellEnd"/>
+      <w:r>
+        <w:rPr>
+          <w:sz w:val="24"/>
+          <w:szCs w:val="24"/>
+          <w:lang w:val="en-US"/>
+        </w:rPr>
+        <w:t xml:space="preserve">, </w:t>
+      </w:r>
+      <w:proofErr w:type="spellStart"/>
+      <w:r>
+        <w:rPr>
+          <w:sz w:val="24"/>
+          <w:szCs w:val="24"/>
+          <w:lang w:val="en-US"/>
+        </w:rPr>
+        <w:t>Total_Incentive_Paid</w:t>
+      </w:r>
+      <w:proofErr w:type="spellEnd"/>
+      <w:r>
+        <w:rPr>
+          <w:sz w:val="24"/>
+          <w:szCs w:val="24"/>
+          <w:lang w:val="en-US"/>
+        </w:rPr>
+        <w:t xml:space="preserve">, </w:t>
+      </w:r>
+      <w:proofErr w:type="spellStart"/>
+      <w:r>
+        <w:rPr>
+          <w:sz w:val="24"/>
+          <w:szCs w:val="24"/>
+          <w:lang w:val="en-US"/>
+        </w:rPr>
+        <w:t>Chart_Visit_Trend</w:t>
+      </w:r>
+      <w:proofErr w:type="spellEnd"/>
+      <w:r>
+        <w:rPr>
+          <w:sz w:val="24"/>
+          <w:szCs w:val="24"/>
+          <w:lang w:val="en-US"/>
+        </w:rPr>
+        <w:t xml:space="preserve">, </w:t>
+      </w:r>
+      <w:proofErr w:type="spellStart"/>
+      <w:r>
+        <w:rPr>
+          <w:sz w:val="24"/>
+          <w:szCs w:val="24"/>
+          <w:lang w:val="en-US"/>
+        </w:rPr>
+        <w:t>Chart_NOO_Growth_By_Area</w:t>
+      </w:r>
+      <w:proofErr w:type="spellEnd"/>
+      <w:r>
+        <w:rPr>
+          <w:sz w:val="24"/>
+          <w:szCs w:val="24"/>
+          <w:lang w:val="en-US"/>
+        </w:rPr>
+        <w:t xml:space="preserve">, </w:t>
+      </w:r>
+      <w:proofErr w:type="spellStart"/>
+      <w:r>
+        <w:rPr>
+          <w:sz w:val="24"/>
+          <w:szCs w:val="24"/>
+          <w:lang w:val="en-US"/>
+        </w:rPr>
+        <w:t>Chart_Commission_Distribution_By_Sales</w:t>
+      </w:r>
+      <w:proofErr w:type="spellEnd"/>
+      <w:r>
+        <w:rPr>
+          <w:sz w:val="24"/>
+          <w:szCs w:val="24"/>
+          <w:lang w:val="en-US"/>
+        </w:rPr>
+        <w:t xml:space="preserve">, </w:t>
+      </w:r>
+      <w:proofErr w:type="spellStart"/>
+      <w:r>
+        <w:rPr>
+          <w:sz w:val="24"/>
+          <w:szCs w:val="24"/>
+          <w:lang w:val="en-US"/>
+        </w:rPr>
+        <w:t>Table_Top_Performers_Sales</w:t>
+      </w:r>
+      <w:proofErr w:type="spellEnd"/>
     </w:p>
     <w:p>
       <w:pPr>
@@ -7305,6 +7415,312 @@
         </w:rPr>
         <w:t xml:space="preserve"> </w:t>
       </w:r>
+      <w:proofErr w:type="spellStart"/>
+      <w:r>
+        <w:rPr>
+          <w:sz w:val="24"/>
+          <w:szCs w:val="24"/>
+          <w:lang w:val="en-US"/>
+        </w:rPr>
+        <w:t>Menyajikan</w:t>
+      </w:r>
+      <w:proofErr w:type="spellEnd"/>
+      <w:r>
+        <w:rPr>
+          <w:sz w:val="24"/>
+          <w:szCs w:val="24"/>
+          <w:lang w:val="en-US"/>
+        </w:rPr>
+        <w:t xml:space="preserve"> </w:t>
+      </w:r>
+      <w:proofErr w:type="spellStart"/>
+      <w:r>
+        <w:rPr>
+          <w:sz w:val="24"/>
+          <w:szCs w:val="24"/>
+          <w:lang w:val="en-US"/>
+        </w:rPr>
+        <w:t>gambaran</w:t>
+      </w:r>
+      <w:proofErr w:type="spellEnd"/>
+      <w:r>
+        <w:rPr>
+          <w:sz w:val="24"/>
+          <w:szCs w:val="24"/>
+          <w:lang w:val="en-US"/>
+        </w:rPr>
+        <w:t xml:space="preserve"> </w:t>
+      </w:r>
+      <w:proofErr w:type="spellStart"/>
+      <w:r>
+        <w:rPr>
+          <w:sz w:val="24"/>
+          <w:szCs w:val="24"/>
+          <w:lang w:val="en-US"/>
+        </w:rPr>
+        <w:t>umum</w:t>
+      </w:r>
+      <w:proofErr w:type="spellEnd"/>
+      <w:r>
+        <w:rPr>
+          <w:sz w:val="24"/>
+          <w:szCs w:val="24"/>
+          <w:lang w:val="en-US"/>
+        </w:rPr>
+        <w:t xml:space="preserve"> </w:t>
+      </w:r>
+      <w:proofErr w:type="spellStart"/>
+      <w:r>
+        <w:rPr>
+          <w:sz w:val="24"/>
+          <w:szCs w:val="24"/>
+          <w:lang w:val="en-US"/>
+        </w:rPr>
+        <w:t>secara</w:t>
+      </w:r>
+      <w:proofErr w:type="spellEnd"/>
+      <w:r>
+        <w:rPr>
+          <w:sz w:val="24"/>
+          <w:szCs w:val="24"/>
+          <w:lang w:val="en-US"/>
+        </w:rPr>
+        <w:t xml:space="preserve"> visual dan real-time </w:t>
+      </w:r>
+      <w:proofErr w:type="spellStart"/>
+      <w:r>
+        <w:rPr>
+          <w:sz w:val="24"/>
+          <w:szCs w:val="24"/>
+          <w:lang w:val="en-US"/>
+        </w:rPr>
+        <w:t>mengenai</w:t>
+      </w:r>
+      <w:proofErr w:type="spellEnd"/>
+      <w:r>
+        <w:rPr>
+          <w:sz w:val="24"/>
+          <w:szCs w:val="24"/>
+          <w:lang w:val="en-US"/>
+        </w:rPr>
+        <w:t xml:space="preserve"> </w:t>
+      </w:r>
+      <w:proofErr w:type="spellStart"/>
+      <w:r>
+        <w:rPr>
+          <w:sz w:val="24"/>
+          <w:szCs w:val="24"/>
+          <w:lang w:val="en-US"/>
+        </w:rPr>
+        <w:t>aktivitas</w:t>
+      </w:r>
+      <w:proofErr w:type="spellEnd"/>
+      <w:r>
+        <w:rPr>
+          <w:sz w:val="24"/>
+          <w:szCs w:val="24"/>
+          <w:lang w:val="en-US"/>
+        </w:rPr>
+        <w:t xml:space="preserve"> </w:t>
+      </w:r>
+      <w:proofErr w:type="spellStart"/>
+      <w:r>
+        <w:rPr>
+          <w:sz w:val="24"/>
+          <w:szCs w:val="24"/>
+          <w:lang w:val="en-US"/>
+        </w:rPr>
+        <w:t>prospeksi</w:t>
+      </w:r>
+      <w:proofErr w:type="spellEnd"/>
+      <w:r>
+        <w:rPr>
+          <w:sz w:val="24"/>
+          <w:szCs w:val="24"/>
+          <w:lang w:val="en-US"/>
+        </w:rPr>
+        <w:t xml:space="preserve"> </w:t>
+      </w:r>
+      <w:proofErr w:type="spellStart"/>
+      <w:r>
+        <w:rPr>
+          <w:sz w:val="24"/>
+          <w:szCs w:val="24"/>
+          <w:lang w:val="en-US"/>
+        </w:rPr>
+        <w:t>lapangan</w:t>
+      </w:r>
+      <w:proofErr w:type="spellEnd"/>
+      <w:r>
+        <w:rPr>
+          <w:sz w:val="24"/>
+          <w:szCs w:val="24"/>
+          <w:lang w:val="en-US"/>
+        </w:rPr>
+        <w:t xml:space="preserve">, </w:t>
+      </w:r>
+      <w:proofErr w:type="spellStart"/>
+      <w:r>
+        <w:rPr>
+          <w:sz w:val="24"/>
+          <w:szCs w:val="24"/>
+          <w:lang w:val="en-US"/>
+        </w:rPr>
+        <w:t>jumlah</w:t>
+      </w:r>
+      <w:proofErr w:type="spellEnd"/>
+      <w:r>
+        <w:rPr>
+          <w:sz w:val="24"/>
+          <w:szCs w:val="24"/>
+          <w:lang w:val="en-US"/>
+        </w:rPr>
+        <w:t xml:space="preserve"> </w:t>
+      </w:r>
+      <w:proofErr w:type="spellStart"/>
+      <w:r>
+        <w:rPr>
+          <w:sz w:val="24"/>
+          <w:szCs w:val="24"/>
+          <w:lang w:val="en-US"/>
+        </w:rPr>
+        <w:t>kunjungan</w:t>
+      </w:r>
+      <w:proofErr w:type="spellEnd"/>
+      <w:r>
+        <w:rPr>
+          <w:sz w:val="24"/>
+          <w:szCs w:val="24"/>
+          <w:lang w:val="en-US"/>
+        </w:rPr>
+        <w:t xml:space="preserve"> marketing, </w:t>
+      </w:r>
+      <w:proofErr w:type="spellStart"/>
+      <w:r>
+        <w:rPr>
+          <w:sz w:val="24"/>
+          <w:szCs w:val="24"/>
+          <w:lang w:val="en-US"/>
+        </w:rPr>
+        <w:t>pertumbuhan</w:t>
+      </w:r>
+      <w:proofErr w:type="spellEnd"/>
+      <w:r>
+        <w:rPr>
+          <w:sz w:val="24"/>
+          <w:szCs w:val="24"/>
+          <w:lang w:val="en-US"/>
+        </w:rPr>
+        <w:t xml:space="preserve"> Outlet Baru (NOO), </w:t>
+      </w:r>
+      <w:proofErr w:type="spellStart"/>
+      <w:r>
+        <w:rPr>
+          <w:sz w:val="24"/>
+          <w:szCs w:val="24"/>
+          <w:lang w:val="en-US"/>
+        </w:rPr>
+        <w:t>serta</w:t>
+      </w:r>
+      <w:proofErr w:type="spellEnd"/>
+      <w:r>
+        <w:rPr>
+          <w:sz w:val="24"/>
+          <w:szCs w:val="24"/>
+          <w:lang w:val="en-US"/>
+        </w:rPr>
+        <w:t xml:space="preserve"> </w:t>
+      </w:r>
+      <w:proofErr w:type="spellStart"/>
+      <w:r>
+        <w:rPr>
+          <w:sz w:val="24"/>
+          <w:szCs w:val="24"/>
+          <w:lang w:val="en-US"/>
+        </w:rPr>
+        <w:t>proyeksi</w:t>
+      </w:r>
+      <w:proofErr w:type="spellEnd"/>
+      <w:r>
+        <w:rPr>
+          <w:sz w:val="24"/>
+          <w:szCs w:val="24"/>
+          <w:lang w:val="en-US"/>
+        </w:rPr>
+        <w:t xml:space="preserve"> dan </w:t>
+      </w:r>
+      <w:proofErr w:type="spellStart"/>
+      <w:r>
+        <w:rPr>
+          <w:sz w:val="24"/>
+          <w:szCs w:val="24"/>
+          <w:lang w:val="en-US"/>
+        </w:rPr>
+        <w:t>realisasi</w:t>
+      </w:r>
+      <w:proofErr w:type="spellEnd"/>
+      <w:r>
+        <w:rPr>
+          <w:sz w:val="24"/>
+          <w:szCs w:val="24"/>
+          <w:lang w:val="en-US"/>
+        </w:rPr>
+        <w:t xml:space="preserve"> </w:t>
+      </w:r>
+      <w:proofErr w:type="spellStart"/>
+      <w:r>
+        <w:rPr>
+          <w:sz w:val="24"/>
+          <w:szCs w:val="24"/>
+          <w:lang w:val="en-US"/>
+        </w:rPr>
+        <w:t>komisi</w:t>
+      </w:r>
+      <w:proofErr w:type="spellEnd"/>
+      <w:r>
+        <w:rPr>
+          <w:sz w:val="24"/>
+          <w:szCs w:val="24"/>
+          <w:lang w:val="en-US"/>
+        </w:rPr>
+        <w:t>/</w:t>
+      </w:r>
+      <w:proofErr w:type="spellStart"/>
+      <w:r>
+        <w:rPr>
+          <w:sz w:val="24"/>
+          <w:szCs w:val="24"/>
+          <w:lang w:val="en-US"/>
+        </w:rPr>
+        <w:t>insentif</w:t>
+      </w:r>
+      <w:proofErr w:type="spellEnd"/>
+      <w:r>
+        <w:rPr>
+          <w:sz w:val="24"/>
+          <w:szCs w:val="24"/>
+          <w:lang w:val="en-US"/>
+        </w:rPr>
+        <w:t xml:space="preserve"> </w:t>
+      </w:r>
+      <w:proofErr w:type="spellStart"/>
+      <w:r>
+        <w:rPr>
+          <w:sz w:val="24"/>
+          <w:szCs w:val="24"/>
+          <w:lang w:val="en-US"/>
+        </w:rPr>
+        <w:t>tim</w:t>
+      </w:r>
+      <w:proofErr w:type="spellEnd"/>
+      <w:r>
+        <w:rPr>
+          <w:sz w:val="24"/>
+          <w:szCs w:val="24"/>
+          <w:lang w:val="en-US"/>
+        </w:rPr>
+        <w:t xml:space="preserve"> sales/BDH.</w:t>
+      </w:r>
     </w:p>
     <w:p>
       <w:pPr>
@@ -7351,6 +7767,438 @@
           <w:lang w:val="en-US"/>
         </w:rPr>
         <w:t xml:space="preserve"> </w:t>
+      </w:r>
+      <w:proofErr w:type="spellStart"/>
+      <w:r>
+        <w:rPr>
+          <w:sz w:val="24"/>
+          <w:szCs w:val="24"/>
+          <w:lang w:val="en-US"/>
+        </w:rPr>
+        <w:t>Tampilan</w:t>
+      </w:r>
+      <w:proofErr w:type="spellEnd"/>
+      <w:r>
+        <w:rPr>
+          <w:sz w:val="24"/>
+          <w:szCs w:val="24"/>
+          <w:lang w:val="en-US"/>
+        </w:rPr>
+        <w:t xml:space="preserve"> </w:t>
+      </w:r>
+      <w:proofErr w:type="spellStart"/>
+      <w:r>
+        <w:rPr>
+          <w:sz w:val="24"/>
+          <w:szCs w:val="24"/>
+          <w:lang w:val="en-US"/>
+        </w:rPr>
+        <w:t>awal</w:t>
+      </w:r>
+      <w:proofErr w:type="spellEnd"/>
+      <w:r>
+        <w:rPr>
+          <w:sz w:val="24"/>
+          <w:szCs w:val="24"/>
+          <w:lang w:val="en-US"/>
+        </w:rPr>
+        <w:t xml:space="preserve"> </w:t>
+      </w:r>
+      <w:proofErr w:type="spellStart"/>
+      <w:r>
+        <w:rPr>
+          <w:sz w:val="24"/>
+          <w:szCs w:val="24"/>
+          <w:lang w:val="en-US"/>
+        </w:rPr>
+        <w:t>berupa</w:t>
+      </w:r>
+      <w:proofErr w:type="spellEnd"/>
+      <w:r>
+        <w:rPr>
+          <w:sz w:val="24"/>
+          <w:szCs w:val="24"/>
+          <w:lang w:val="en-US"/>
+        </w:rPr>
+        <w:t xml:space="preserve"> dashboard </w:t>
+      </w:r>
+      <w:proofErr w:type="spellStart"/>
+      <w:r>
+        <w:rPr>
+          <w:sz w:val="24"/>
+          <w:szCs w:val="24"/>
+          <w:lang w:val="en-US"/>
+        </w:rPr>
+        <w:t>interaktif</w:t>
+      </w:r>
+      <w:proofErr w:type="spellEnd"/>
+      <w:r>
+        <w:rPr>
+          <w:sz w:val="24"/>
+          <w:szCs w:val="24"/>
+          <w:lang w:val="en-US"/>
+        </w:rPr>
+        <w:t xml:space="preserve"> </w:t>
+      </w:r>
+      <w:proofErr w:type="spellStart"/>
+      <w:r>
+        <w:rPr>
+          <w:sz w:val="24"/>
+          <w:szCs w:val="24"/>
+          <w:lang w:val="en-US"/>
+        </w:rPr>
+        <w:t>berisi</w:t>
+      </w:r>
+      <w:proofErr w:type="spellEnd"/>
+      <w:r>
+        <w:rPr>
+          <w:sz w:val="24"/>
+          <w:szCs w:val="24"/>
+          <w:lang w:val="en-US"/>
+        </w:rPr>
+        <w:t xml:space="preserve"> </w:t>
+      </w:r>
+      <w:proofErr w:type="spellStart"/>
+      <w:r>
+        <w:rPr>
+          <w:sz w:val="24"/>
+          <w:szCs w:val="24"/>
+          <w:lang w:val="en-US"/>
+        </w:rPr>
+        <w:t>ringkasan</w:t>
+      </w:r>
+      <w:proofErr w:type="spellEnd"/>
+      <w:r>
+        <w:rPr>
+          <w:sz w:val="24"/>
+          <w:szCs w:val="24"/>
+          <w:lang w:val="en-US"/>
+        </w:rPr>
+        <w:t xml:space="preserve"> widget </w:t>
+      </w:r>
+      <w:proofErr w:type="spellStart"/>
+      <w:r>
+        <w:rPr>
+          <w:sz w:val="24"/>
+          <w:szCs w:val="24"/>
+          <w:lang w:val="en-US"/>
+        </w:rPr>
+        <w:t>angka</w:t>
+      </w:r>
+      <w:proofErr w:type="spellEnd"/>
+      <w:r>
+        <w:rPr>
+          <w:sz w:val="24"/>
+          <w:szCs w:val="24"/>
+          <w:lang w:val="en-US"/>
+        </w:rPr>
+        <w:t xml:space="preserve"> (card stat), </w:t>
+      </w:r>
+      <w:proofErr w:type="spellStart"/>
+      <w:r>
+        <w:rPr>
+          <w:sz w:val="24"/>
+          <w:szCs w:val="24"/>
+          <w:lang w:val="en-US"/>
+        </w:rPr>
+        <w:t>grafik</w:t>
+      </w:r>
+      <w:proofErr w:type="spellEnd"/>
+      <w:r>
+        <w:rPr>
+          <w:sz w:val="24"/>
+          <w:szCs w:val="24"/>
+          <w:lang w:val="en-US"/>
+        </w:rPr>
+        <w:t xml:space="preserve"> </w:t>
+      </w:r>
+      <w:proofErr w:type="spellStart"/>
+      <w:r>
+        <w:rPr>
+          <w:sz w:val="24"/>
+          <w:szCs w:val="24"/>
+          <w:lang w:val="en-US"/>
+        </w:rPr>
+        <w:t>tren</w:t>
+      </w:r>
+      <w:proofErr w:type="spellEnd"/>
+      <w:r>
+        <w:rPr>
+          <w:sz w:val="24"/>
+          <w:szCs w:val="24"/>
+          <w:lang w:val="en-US"/>
+        </w:rPr>
+        <w:t xml:space="preserve"> </w:t>
+      </w:r>
+      <w:proofErr w:type="spellStart"/>
+      <w:r>
+        <w:rPr>
+          <w:sz w:val="24"/>
+          <w:szCs w:val="24"/>
+          <w:lang w:val="en-US"/>
+        </w:rPr>
+        <w:t>kunjungan</w:t>
+      </w:r>
+      <w:proofErr w:type="spellEnd"/>
+      <w:r>
+        <w:rPr>
+          <w:sz w:val="24"/>
+          <w:szCs w:val="24"/>
+          <w:lang w:val="en-US"/>
+        </w:rPr>
+        <w:t xml:space="preserve"> </w:t>
+      </w:r>
+      <w:proofErr w:type="spellStart"/>
+      <w:r>
+        <w:rPr>
+          <w:sz w:val="24"/>
+          <w:szCs w:val="24"/>
+          <w:lang w:val="en-US"/>
+        </w:rPr>
+        <w:t>lapangan</w:t>
+      </w:r>
+      <w:proofErr w:type="spellEnd"/>
+      <w:r>
+        <w:rPr>
+          <w:sz w:val="24"/>
+          <w:szCs w:val="24"/>
+          <w:lang w:val="en-US"/>
+        </w:rPr>
+        <w:t xml:space="preserve">, diagram </w:t>
+      </w:r>
+      <w:proofErr w:type="spellStart"/>
+      <w:r>
+        <w:rPr>
+          <w:sz w:val="24"/>
+          <w:szCs w:val="24"/>
+          <w:lang w:val="en-US"/>
+        </w:rPr>
+        <w:t>pertumbuhan</w:t>
+      </w:r>
+      <w:proofErr w:type="spellEnd"/>
+      <w:r>
+        <w:rPr>
+          <w:sz w:val="24"/>
+          <w:szCs w:val="24"/>
+          <w:lang w:val="en-US"/>
+        </w:rPr>
+        <w:t xml:space="preserve"> </w:t>
+      </w:r>
+      <w:proofErr w:type="spellStart"/>
+      <w:r>
+        <w:rPr>
+          <w:sz w:val="24"/>
+          <w:szCs w:val="24"/>
+          <w:lang w:val="en-US"/>
+        </w:rPr>
+        <w:t>pelanggan</w:t>
+      </w:r>
+      <w:proofErr w:type="spellEnd"/>
+      <w:r>
+        <w:rPr>
+          <w:sz w:val="24"/>
+          <w:szCs w:val="24"/>
+          <w:lang w:val="en-US"/>
+        </w:rPr>
+        <w:t xml:space="preserve"> </w:t>
+      </w:r>
+      <w:proofErr w:type="spellStart"/>
+      <w:r>
+        <w:rPr>
+          <w:sz w:val="24"/>
+          <w:szCs w:val="24"/>
+          <w:lang w:val="en-US"/>
+        </w:rPr>
+        <w:t>baru</w:t>
+      </w:r>
+      <w:proofErr w:type="spellEnd"/>
+      <w:r>
+        <w:rPr>
+          <w:sz w:val="24"/>
+          <w:szCs w:val="24"/>
+          <w:lang w:val="en-US"/>
+        </w:rPr>
+        <w:t xml:space="preserve"> per wilayah, </w:t>
+      </w:r>
+      <w:proofErr w:type="spellStart"/>
+      <w:r>
+        <w:rPr>
+          <w:sz w:val="24"/>
+          <w:szCs w:val="24"/>
+          <w:lang w:val="en-US"/>
+        </w:rPr>
+        <w:t>serta</w:t>
+      </w:r>
+      <w:proofErr w:type="spellEnd"/>
+      <w:r>
+        <w:rPr>
+          <w:sz w:val="24"/>
+          <w:szCs w:val="24"/>
+          <w:lang w:val="en-US"/>
+        </w:rPr>
+        <w:t xml:space="preserve"> </w:t>
+      </w:r>
+      <w:proofErr w:type="spellStart"/>
+      <w:r>
+        <w:rPr>
+          <w:sz w:val="24"/>
+          <w:szCs w:val="24"/>
+          <w:lang w:val="en-US"/>
+        </w:rPr>
+        <w:t>tabel</w:t>
+      </w:r>
+      <w:proofErr w:type="spellEnd"/>
+      <w:r>
+        <w:rPr>
+          <w:sz w:val="24"/>
+          <w:szCs w:val="24"/>
+          <w:lang w:val="en-US"/>
+        </w:rPr>
+        <w:t xml:space="preserve"> </w:t>
+      </w:r>
+      <w:proofErr w:type="spellStart"/>
+      <w:r>
+        <w:rPr>
+          <w:sz w:val="24"/>
+          <w:szCs w:val="24"/>
+          <w:lang w:val="en-US"/>
+        </w:rPr>
+        <w:t>peringkat</w:t>
+      </w:r>
+      <w:proofErr w:type="spellEnd"/>
+      <w:r>
+        <w:rPr>
+          <w:sz w:val="24"/>
+          <w:szCs w:val="24"/>
+          <w:lang w:val="en-US"/>
+        </w:rPr>
+        <w:t xml:space="preserve"> </w:t>
+      </w:r>
+      <w:proofErr w:type="spellStart"/>
+      <w:r>
+        <w:rPr>
+          <w:sz w:val="24"/>
+          <w:szCs w:val="24"/>
+          <w:lang w:val="en-US"/>
+        </w:rPr>
+        <w:t>pencapaian</w:t>
+      </w:r>
+      <w:proofErr w:type="spellEnd"/>
+      <w:r>
+        <w:rPr>
+          <w:sz w:val="24"/>
+          <w:szCs w:val="24"/>
+          <w:lang w:val="en-US"/>
+        </w:rPr>
+        <w:t xml:space="preserve"> </w:t>
+      </w:r>
+      <w:proofErr w:type="spellStart"/>
+      <w:r>
+        <w:rPr>
+          <w:sz w:val="24"/>
+          <w:szCs w:val="24"/>
+          <w:lang w:val="en-US"/>
+        </w:rPr>
+        <w:t>tim</w:t>
+      </w:r>
+      <w:proofErr w:type="spellEnd"/>
+      <w:r>
+        <w:rPr>
+          <w:sz w:val="24"/>
+          <w:szCs w:val="24"/>
+          <w:lang w:val="en-US"/>
+        </w:rPr>
+        <w:t xml:space="preserve"> marketing. Halaman </w:t>
+      </w:r>
+      <w:proofErr w:type="spellStart"/>
+      <w:r>
+        <w:rPr>
+          <w:sz w:val="24"/>
+          <w:szCs w:val="24"/>
+          <w:lang w:val="en-US"/>
+        </w:rPr>
+        <w:t>bersifat</w:t>
+      </w:r>
+      <w:proofErr w:type="spellEnd"/>
+      <w:r>
+        <w:rPr>
+          <w:sz w:val="24"/>
+          <w:szCs w:val="24"/>
+          <w:lang w:val="en-US"/>
+        </w:rPr>
+        <w:t xml:space="preserve"> Read-Only dan </w:t>
+      </w:r>
+      <w:proofErr w:type="spellStart"/>
+      <w:r>
+        <w:rPr>
+          <w:sz w:val="24"/>
+          <w:szCs w:val="24"/>
+          <w:lang w:val="en-US"/>
+        </w:rPr>
+        <w:t>dilengkapi</w:t>
+      </w:r>
+      <w:proofErr w:type="spellEnd"/>
+      <w:r>
+        <w:rPr>
+          <w:sz w:val="24"/>
+          <w:szCs w:val="24"/>
+          <w:lang w:val="en-US"/>
+        </w:rPr>
+        <w:t xml:space="preserve"> filter </w:t>
+      </w:r>
+      <w:proofErr w:type="spellStart"/>
+      <w:r>
+        <w:rPr>
+          <w:sz w:val="24"/>
+          <w:szCs w:val="24"/>
+          <w:lang w:val="en-US"/>
+        </w:rPr>
+        <w:t>periode</w:t>
+      </w:r>
+      <w:proofErr w:type="spellEnd"/>
+      <w:r>
+        <w:rPr>
+          <w:sz w:val="24"/>
+          <w:szCs w:val="24"/>
+          <w:lang w:val="en-US"/>
+        </w:rPr>
+        <w:t xml:space="preserve"> </w:t>
+      </w:r>
+      <w:proofErr w:type="spellStart"/>
+      <w:r>
+        <w:rPr>
+          <w:sz w:val="24"/>
+          <w:szCs w:val="24"/>
+          <w:lang w:val="en-US"/>
+        </w:rPr>
+        <w:t>tanggal</w:t>
+      </w:r>
+      <w:proofErr w:type="spellEnd"/>
+      <w:r>
+        <w:rPr>
+          <w:sz w:val="24"/>
+          <w:szCs w:val="24"/>
+          <w:lang w:val="en-US"/>
+        </w:rPr>
+        <w:t xml:space="preserve">, area/rayon, </w:t>
+      </w:r>
+      <w:proofErr w:type="spellStart"/>
+      <w:r>
+        <w:rPr>
+          <w:sz w:val="24"/>
+          <w:szCs w:val="24"/>
+          <w:lang w:val="en-US"/>
+        </w:rPr>
+        <w:t>serta</w:t>
+      </w:r>
+      <w:proofErr w:type="spellEnd"/>
+      <w:r>
+        <w:rPr>
+          <w:sz w:val="24"/>
+          <w:szCs w:val="24"/>
+          <w:lang w:val="en-US"/>
+        </w:rPr>
+        <w:t xml:space="preserve"> nama sales/marketing.</w:t>
       </w:r>
     </w:p>
     <w:p>
@@ -7386,6 +8234,7 @@
           <w:lang w:val="en-US"/>
         </w:rPr>
       </w:pPr>
+      <w:proofErr w:type="gramStart"/>
       <w:r>
         <w:rPr>
           <w:b/>
@@ -7394,8 +8243,9 @@
           <w:szCs w:val="24"/>
           <w:lang w:val="en-US"/>
         </w:rPr>
-        <w:t xml:space="preserve">Dashboard </w:t>
-      </w:r>
+        <w:t>Non Customer</w:t>
+      </w:r>
+      <w:proofErr w:type="gramEnd"/>
       <w:r>
         <w:rPr>
           <w:b/>
@@ -7404,31 +8254,15 @@
           <w:szCs w:val="24"/>
           <w:lang w:val="en-US"/>
         </w:rPr>
-        <w:t>Production Proses</w:t>
-      </w:r>
-      <w:r>
-        <w:rPr>
-          <w:sz w:val="24"/>
-          <w:szCs w:val="24"/>
-          <w:lang w:val="en-US"/>
-        </w:rPr>
-        <w:t xml:space="preserve"> `</w:t>
-      </w:r>
-      <w:r>
-        <w:rPr>
-          <w:sz w:val="24"/>
-          <w:szCs w:val="24"/>
-          <w:lang w:val="en-US"/>
-        </w:rPr>
-        <w:t>production-process-dashboard</w:t>
-      </w:r>
-      <w:r>
-        <w:rPr>
-          <w:sz w:val="24"/>
-          <w:szCs w:val="24"/>
-          <w:lang w:val="en-US"/>
-        </w:rPr>
-        <w:t>`</w:t>
+        <w:t xml:space="preserve"> </w:t>
+      </w:r>
+      <w:r>
+        <w:rPr>
+          <w:sz w:val="24"/>
+          <w:szCs w:val="24"/>
+          <w:lang w:val="en-US"/>
+        </w:rPr>
+        <w:t>`non-customer`</w:t>
       </w:r>
     </w:p>
     <w:p>
@@ -7475,6 +8309,160 @@
         </w:rPr>
         <w:t xml:space="preserve"> </w:t>
       </w:r>
+      <w:proofErr w:type="gramStart"/>
+      <w:r>
+        <w:rPr>
+          <w:sz w:val="24"/>
+          <w:szCs w:val="24"/>
+          <w:lang w:val="en-US"/>
+        </w:rPr>
+        <w:t>Non Customer</w:t>
+      </w:r>
+      <w:proofErr w:type="gramEnd"/>
+      <w:r>
+        <w:rPr>
+          <w:sz w:val="24"/>
+          <w:szCs w:val="24"/>
+          <w:lang w:val="en-US"/>
+        </w:rPr>
+        <w:t xml:space="preserve"> ID, Name, Contact, Position, Address1, Address2, </w:t>
+      </w:r>
+      <w:proofErr w:type="spellStart"/>
+      <w:r>
+        <w:rPr>
+          <w:sz w:val="24"/>
+          <w:szCs w:val="24"/>
+          <w:lang w:val="en-US"/>
+        </w:rPr>
+        <w:t>Kecamatan</w:t>
+      </w:r>
+      <w:proofErr w:type="spellEnd"/>
+      <w:r>
+        <w:rPr>
+          <w:sz w:val="24"/>
+          <w:szCs w:val="24"/>
+          <w:lang w:val="en-US"/>
+        </w:rPr>
+        <w:t xml:space="preserve">, </w:t>
+      </w:r>
+      <w:proofErr w:type="spellStart"/>
+      <w:r>
+        <w:rPr>
+          <w:sz w:val="24"/>
+          <w:szCs w:val="24"/>
+          <w:lang w:val="en-US"/>
+        </w:rPr>
+        <w:t>Kabupaten</w:t>
+      </w:r>
+      <w:proofErr w:type="spellEnd"/>
+      <w:r>
+        <w:rPr>
+          <w:sz w:val="24"/>
+          <w:szCs w:val="24"/>
+          <w:lang w:val="en-US"/>
+        </w:rPr>
+        <w:t xml:space="preserve">, City, ZIP, Province, Country, </w:t>
+      </w:r>
+      <w:proofErr w:type="spellStart"/>
+      <w:r>
+        <w:rPr>
+          <w:sz w:val="24"/>
+          <w:szCs w:val="24"/>
+          <w:lang w:val="en-US"/>
+        </w:rPr>
+        <w:t>Channel_Outlet</w:t>
+      </w:r>
+      <w:proofErr w:type="spellEnd"/>
+      <w:r>
+        <w:rPr>
+          <w:sz w:val="24"/>
+          <w:szCs w:val="24"/>
+          <w:lang w:val="en-US"/>
+        </w:rPr>
+        <w:t xml:space="preserve">, </w:t>
+      </w:r>
+      <w:proofErr w:type="spellStart"/>
+      <w:r>
+        <w:rPr>
+          <w:sz w:val="24"/>
+          <w:szCs w:val="24"/>
+          <w:lang w:val="en-US"/>
+        </w:rPr>
+        <w:t>Kode_area</w:t>
+      </w:r>
+      <w:proofErr w:type="spellEnd"/>
+      <w:r>
+        <w:rPr>
+          <w:sz w:val="24"/>
+          <w:szCs w:val="24"/>
+          <w:lang w:val="en-US"/>
+        </w:rPr>
+        <w:t xml:space="preserve">, Phone, </w:t>
+      </w:r>
+      <w:proofErr w:type="spellStart"/>
+      <w:r>
+        <w:rPr>
+          <w:sz w:val="24"/>
+          <w:szCs w:val="24"/>
+          <w:lang w:val="en-US"/>
+        </w:rPr>
+        <w:t>Mobile_Phone</w:t>
+      </w:r>
+      <w:proofErr w:type="spellEnd"/>
+      <w:r>
+        <w:rPr>
+          <w:sz w:val="24"/>
+          <w:szCs w:val="24"/>
+          <w:lang w:val="en-US"/>
+        </w:rPr>
+        <w:t xml:space="preserve">, Email, </w:t>
+      </w:r>
+      <w:proofErr w:type="spellStart"/>
+      <w:r>
+        <w:rPr>
+          <w:sz w:val="24"/>
+          <w:szCs w:val="24"/>
+          <w:lang w:val="en-US"/>
+        </w:rPr>
+        <w:t>Employee_Id</w:t>
+      </w:r>
+      <w:proofErr w:type="spellEnd"/>
+      <w:r>
+        <w:rPr>
+          <w:sz w:val="24"/>
+          <w:szCs w:val="24"/>
+          <w:lang w:val="en-US"/>
+        </w:rPr>
+        <w:t xml:space="preserve">, </w:t>
+      </w:r>
+      <w:proofErr w:type="spellStart"/>
+      <w:proofErr w:type="gramStart"/>
+      <w:r>
+        <w:rPr>
+          <w:sz w:val="24"/>
+          <w:szCs w:val="24"/>
+          <w:lang w:val="en-US"/>
+        </w:rPr>
+        <w:t>Created</w:t>
+      </w:r>
+      <w:proofErr w:type="gramEnd"/>
+      <w:r>
+        <w:rPr>
+          <w:sz w:val="24"/>
+          <w:szCs w:val="24"/>
+          <w:lang w:val="en-US"/>
+        </w:rPr>
+        <w:t>_Date</w:t>
+      </w:r>
+      <w:proofErr w:type="spellEnd"/>
+      <w:r>
+        <w:rPr>
+          <w:sz w:val="24"/>
+          <w:szCs w:val="24"/>
+          <w:lang w:val="en-US"/>
+        </w:rPr>
+        <w:t>, Note, NPWP, Status</w:t>
+      </w:r>
     </w:p>
     <w:p>
       <w:pPr>
@@ -7522,6 +8510,330 @@
         </w:rPr>
         <w:t xml:space="preserve"> </w:t>
       </w:r>
+      <w:proofErr w:type="spellStart"/>
+      <w:r>
+        <w:rPr>
+          <w:sz w:val="24"/>
+          <w:szCs w:val="24"/>
+          <w:lang w:val="en-US"/>
+        </w:rPr>
+        <w:t>Mengelola</w:t>
+      </w:r>
+      <w:proofErr w:type="spellEnd"/>
+      <w:r>
+        <w:rPr>
+          <w:sz w:val="24"/>
+          <w:szCs w:val="24"/>
+          <w:lang w:val="en-US"/>
+        </w:rPr>
+        <w:t xml:space="preserve"> data </w:t>
+      </w:r>
+      <w:proofErr w:type="spellStart"/>
+      <w:r>
+        <w:rPr>
+          <w:sz w:val="24"/>
+          <w:szCs w:val="24"/>
+          <w:lang w:val="en-US"/>
+        </w:rPr>
+        <w:t>calon</w:t>
+      </w:r>
+      <w:proofErr w:type="spellEnd"/>
+      <w:r>
+        <w:rPr>
+          <w:sz w:val="24"/>
+          <w:szCs w:val="24"/>
+          <w:lang w:val="en-US"/>
+        </w:rPr>
+        <w:t xml:space="preserve"> </w:t>
+      </w:r>
+      <w:proofErr w:type="spellStart"/>
+      <w:r>
+        <w:rPr>
+          <w:sz w:val="24"/>
+          <w:szCs w:val="24"/>
+          <w:lang w:val="en-US"/>
+        </w:rPr>
+        <w:t>pelanggan</w:t>
+      </w:r>
+      <w:proofErr w:type="spellEnd"/>
+      <w:r>
+        <w:rPr>
+          <w:sz w:val="24"/>
+          <w:szCs w:val="24"/>
+          <w:lang w:val="en-US"/>
+        </w:rPr>
+        <w:t xml:space="preserve"> (</w:t>
+      </w:r>
+      <w:proofErr w:type="spellStart"/>
+      <w:r>
+        <w:rPr>
+          <w:sz w:val="24"/>
+          <w:szCs w:val="24"/>
+          <w:lang w:val="en-US"/>
+        </w:rPr>
+        <w:t>prospek</w:t>
+      </w:r>
+      <w:proofErr w:type="spellEnd"/>
+      <w:r>
+        <w:rPr>
+          <w:sz w:val="24"/>
+          <w:szCs w:val="24"/>
+          <w:lang w:val="en-US"/>
+        </w:rPr>
+        <w:t xml:space="preserve">/lead) yang </w:t>
+      </w:r>
+      <w:proofErr w:type="spellStart"/>
+      <w:r>
+        <w:rPr>
+          <w:sz w:val="24"/>
+          <w:szCs w:val="24"/>
+          <w:lang w:val="en-US"/>
+        </w:rPr>
+        <w:t>belum</w:t>
+      </w:r>
+      <w:proofErr w:type="spellEnd"/>
+      <w:r>
+        <w:rPr>
+          <w:sz w:val="24"/>
+          <w:szCs w:val="24"/>
+          <w:lang w:val="en-US"/>
+        </w:rPr>
+        <w:t xml:space="preserve"> </w:t>
+      </w:r>
+      <w:proofErr w:type="spellStart"/>
+      <w:r>
+        <w:rPr>
+          <w:sz w:val="24"/>
+          <w:szCs w:val="24"/>
+          <w:lang w:val="en-US"/>
+        </w:rPr>
+        <w:t>terdaftar</w:t>
+      </w:r>
+      <w:proofErr w:type="spellEnd"/>
+      <w:r>
+        <w:rPr>
+          <w:sz w:val="24"/>
+          <w:szCs w:val="24"/>
+          <w:lang w:val="en-US"/>
+        </w:rPr>
+        <w:t xml:space="preserve"> </w:t>
+      </w:r>
+      <w:proofErr w:type="spellStart"/>
+      <w:r>
+        <w:rPr>
+          <w:sz w:val="24"/>
+          <w:szCs w:val="24"/>
+          <w:lang w:val="en-US"/>
+        </w:rPr>
+        <w:t>secara</w:t>
+      </w:r>
+      <w:proofErr w:type="spellEnd"/>
+      <w:r>
+        <w:rPr>
+          <w:sz w:val="24"/>
+          <w:szCs w:val="24"/>
+          <w:lang w:val="en-US"/>
+        </w:rPr>
+        <w:t xml:space="preserve"> </w:t>
+      </w:r>
+      <w:proofErr w:type="spellStart"/>
+      <w:r>
+        <w:rPr>
+          <w:sz w:val="24"/>
+          <w:szCs w:val="24"/>
+          <w:lang w:val="en-US"/>
+        </w:rPr>
+        <w:t>resmi</w:t>
+      </w:r>
+      <w:proofErr w:type="spellEnd"/>
+      <w:r>
+        <w:rPr>
+          <w:sz w:val="24"/>
+          <w:szCs w:val="24"/>
+          <w:lang w:val="en-US"/>
+        </w:rPr>
+        <w:t xml:space="preserve"> </w:t>
+      </w:r>
+      <w:proofErr w:type="spellStart"/>
+      <w:r>
+        <w:rPr>
+          <w:sz w:val="24"/>
+          <w:szCs w:val="24"/>
+          <w:lang w:val="en-US"/>
+        </w:rPr>
+        <w:t>sebagai</w:t>
+      </w:r>
+      <w:proofErr w:type="spellEnd"/>
+      <w:r>
+        <w:rPr>
+          <w:sz w:val="24"/>
+          <w:szCs w:val="24"/>
+          <w:lang w:val="en-US"/>
+        </w:rPr>
+        <w:t xml:space="preserve"> </w:t>
+      </w:r>
+      <w:proofErr w:type="spellStart"/>
+      <w:r>
+        <w:rPr>
+          <w:sz w:val="24"/>
+          <w:szCs w:val="24"/>
+          <w:lang w:val="en-US"/>
+        </w:rPr>
+        <w:t>pelanggan</w:t>
+      </w:r>
+      <w:proofErr w:type="spellEnd"/>
+      <w:r>
+        <w:rPr>
+          <w:sz w:val="24"/>
+          <w:szCs w:val="24"/>
+          <w:lang w:val="en-US"/>
+        </w:rPr>
+        <w:t xml:space="preserve"> </w:t>
+      </w:r>
+      <w:proofErr w:type="spellStart"/>
+      <w:r>
+        <w:rPr>
+          <w:sz w:val="24"/>
+          <w:szCs w:val="24"/>
+          <w:lang w:val="en-US"/>
+        </w:rPr>
+        <w:t>aktif</w:t>
+      </w:r>
+      <w:proofErr w:type="spellEnd"/>
+      <w:r>
+        <w:rPr>
+          <w:sz w:val="24"/>
+          <w:szCs w:val="24"/>
+          <w:lang w:val="en-US"/>
+        </w:rPr>
+        <w:t xml:space="preserve">, </w:t>
+      </w:r>
+      <w:proofErr w:type="spellStart"/>
+      <w:r>
+        <w:rPr>
+          <w:sz w:val="24"/>
+          <w:szCs w:val="24"/>
+          <w:lang w:val="en-US"/>
+        </w:rPr>
+        <w:t>mencakup</w:t>
+      </w:r>
+      <w:proofErr w:type="spellEnd"/>
+      <w:r>
+        <w:rPr>
+          <w:sz w:val="24"/>
+          <w:szCs w:val="24"/>
+          <w:lang w:val="en-US"/>
+        </w:rPr>
+        <w:t xml:space="preserve"> </w:t>
+      </w:r>
+      <w:proofErr w:type="spellStart"/>
+      <w:r>
+        <w:rPr>
+          <w:sz w:val="24"/>
+          <w:szCs w:val="24"/>
+          <w:lang w:val="en-US"/>
+        </w:rPr>
+        <w:t>profil</w:t>
+      </w:r>
+      <w:proofErr w:type="spellEnd"/>
+      <w:r>
+        <w:rPr>
+          <w:sz w:val="24"/>
+          <w:szCs w:val="24"/>
+          <w:lang w:val="en-US"/>
+        </w:rPr>
+        <w:t xml:space="preserve"> </w:t>
+      </w:r>
+      <w:proofErr w:type="spellStart"/>
+      <w:r>
+        <w:rPr>
+          <w:sz w:val="24"/>
+          <w:szCs w:val="24"/>
+          <w:lang w:val="en-US"/>
+        </w:rPr>
+        <w:t>lokasi</w:t>
+      </w:r>
+      <w:proofErr w:type="spellEnd"/>
+      <w:r>
+        <w:rPr>
+          <w:sz w:val="24"/>
+          <w:szCs w:val="24"/>
+          <w:lang w:val="en-US"/>
+        </w:rPr>
+        <w:t xml:space="preserve">, </w:t>
+      </w:r>
+      <w:proofErr w:type="spellStart"/>
+      <w:r>
+        <w:rPr>
+          <w:sz w:val="24"/>
+          <w:szCs w:val="24"/>
+          <w:lang w:val="en-US"/>
+        </w:rPr>
+        <w:t>kontak</w:t>
+      </w:r>
+      <w:proofErr w:type="spellEnd"/>
+      <w:r>
+        <w:rPr>
+          <w:sz w:val="24"/>
+          <w:szCs w:val="24"/>
+          <w:lang w:val="en-US"/>
+        </w:rPr>
+        <w:t xml:space="preserve"> PIC, </w:t>
+      </w:r>
+      <w:proofErr w:type="spellStart"/>
+      <w:r>
+        <w:rPr>
+          <w:sz w:val="24"/>
+          <w:szCs w:val="24"/>
+          <w:lang w:val="en-US"/>
+        </w:rPr>
+        <w:t>serta</w:t>
+      </w:r>
+      <w:proofErr w:type="spellEnd"/>
+      <w:r>
+        <w:rPr>
+          <w:sz w:val="24"/>
+          <w:szCs w:val="24"/>
+          <w:lang w:val="en-US"/>
+        </w:rPr>
+        <w:t xml:space="preserve"> status </w:t>
+      </w:r>
+      <w:proofErr w:type="spellStart"/>
+      <w:r>
+        <w:rPr>
+          <w:sz w:val="24"/>
+          <w:szCs w:val="24"/>
+          <w:lang w:val="en-US"/>
+        </w:rPr>
+        <w:t>konversi</w:t>
+      </w:r>
+      <w:proofErr w:type="spellEnd"/>
+      <w:r>
+        <w:rPr>
+          <w:sz w:val="24"/>
+          <w:szCs w:val="24"/>
+          <w:lang w:val="en-US"/>
+        </w:rPr>
+        <w:t xml:space="preserve"> </w:t>
+      </w:r>
+      <w:proofErr w:type="spellStart"/>
+      <w:r>
+        <w:rPr>
+          <w:sz w:val="24"/>
+          <w:szCs w:val="24"/>
+          <w:lang w:val="en-US"/>
+        </w:rPr>
+        <w:t>prospek</w:t>
+      </w:r>
+      <w:proofErr w:type="spellEnd"/>
+      <w:r>
+        <w:rPr>
+          <w:sz w:val="24"/>
+          <w:szCs w:val="24"/>
+          <w:lang w:val="en-US"/>
+        </w:rPr>
+        <w:t>.</w:t>
+      </w:r>
     </w:p>
     <w:p>
       <w:pPr>
@@ -7568,6 +8880,348 @@
           <w:lang w:val="en-US"/>
         </w:rPr>
         <w:t xml:space="preserve"> </w:t>
+      </w:r>
+      <w:proofErr w:type="spellStart"/>
+      <w:r>
+        <w:rPr>
+          <w:sz w:val="24"/>
+          <w:szCs w:val="24"/>
+          <w:lang w:val="en-US"/>
+        </w:rPr>
+        <w:t>Tampilan</w:t>
+      </w:r>
+      <w:proofErr w:type="spellEnd"/>
+      <w:r>
+        <w:rPr>
+          <w:sz w:val="24"/>
+          <w:szCs w:val="24"/>
+          <w:lang w:val="en-US"/>
+        </w:rPr>
+        <w:t xml:space="preserve"> </w:t>
+      </w:r>
+      <w:proofErr w:type="spellStart"/>
+      <w:r>
+        <w:rPr>
+          <w:sz w:val="24"/>
+          <w:szCs w:val="24"/>
+          <w:lang w:val="en-US"/>
+        </w:rPr>
+        <w:t>awal</w:t>
+      </w:r>
+      <w:proofErr w:type="spellEnd"/>
+      <w:r>
+        <w:rPr>
+          <w:sz w:val="24"/>
+          <w:szCs w:val="24"/>
+          <w:lang w:val="en-US"/>
+        </w:rPr>
+        <w:t xml:space="preserve"> </w:t>
+      </w:r>
+      <w:proofErr w:type="spellStart"/>
+      <w:r>
+        <w:rPr>
+          <w:sz w:val="24"/>
+          <w:szCs w:val="24"/>
+          <w:lang w:val="en-US"/>
+        </w:rPr>
+        <w:t>berupa</w:t>
+      </w:r>
+      <w:proofErr w:type="spellEnd"/>
+      <w:r>
+        <w:rPr>
+          <w:sz w:val="24"/>
+          <w:szCs w:val="24"/>
+          <w:lang w:val="en-US"/>
+        </w:rPr>
+        <w:t xml:space="preserve"> table data grid </w:t>
+      </w:r>
+      <w:proofErr w:type="spellStart"/>
+      <w:r>
+        <w:rPr>
+          <w:sz w:val="24"/>
+          <w:szCs w:val="24"/>
+          <w:lang w:val="en-US"/>
+        </w:rPr>
+        <w:t>berfitur</w:t>
+      </w:r>
+      <w:proofErr w:type="spellEnd"/>
+      <w:r>
+        <w:rPr>
+          <w:sz w:val="24"/>
+          <w:szCs w:val="24"/>
+          <w:lang w:val="en-US"/>
+        </w:rPr>
+        <w:t xml:space="preserve"> </w:t>
+      </w:r>
+      <w:proofErr w:type="spellStart"/>
+      <w:r>
+        <w:rPr>
+          <w:sz w:val="24"/>
+          <w:szCs w:val="24"/>
+          <w:lang w:val="en-US"/>
+        </w:rPr>
+        <w:t>pencarian</w:t>
+      </w:r>
+      <w:proofErr w:type="spellEnd"/>
+      <w:r>
+        <w:rPr>
+          <w:sz w:val="24"/>
+          <w:szCs w:val="24"/>
+          <w:lang w:val="en-US"/>
+        </w:rPr>
+        <w:t xml:space="preserve"> </w:t>
+      </w:r>
+      <w:proofErr w:type="spellStart"/>
+      <w:r>
+        <w:rPr>
+          <w:sz w:val="24"/>
+          <w:szCs w:val="24"/>
+          <w:lang w:val="en-US"/>
+        </w:rPr>
+        <w:t>cepat</w:t>
+      </w:r>
+      <w:proofErr w:type="spellEnd"/>
+      <w:r>
+        <w:rPr>
+          <w:sz w:val="24"/>
+          <w:szCs w:val="24"/>
+          <w:lang w:val="en-US"/>
+        </w:rPr>
+        <w:t xml:space="preserve"> dan filter status </w:t>
+      </w:r>
+      <w:proofErr w:type="spellStart"/>
+      <w:r>
+        <w:rPr>
+          <w:sz w:val="24"/>
+          <w:szCs w:val="24"/>
+          <w:lang w:val="en-US"/>
+        </w:rPr>
+        <w:t>prospek</w:t>
+      </w:r>
+      <w:proofErr w:type="spellEnd"/>
+      <w:r>
+        <w:rPr>
+          <w:sz w:val="24"/>
+          <w:szCs w:val="24"/>
+          <w:lang w:val="en-US"/>
+        </w:rPr>
+        <w:t xml:space="preserve"> (Prospect/In Follow-up/Converted/Rejected). </w:t>
+      </w:r>
+      <w:proofErr w:type="spellStart"/>
+      <w:r>
+        <w:rPr>
+          <w:sz w:val="24"/>
+          <w:szCs w:val="24"/>
+          <w:lang w:val="en-US"/>
+        </w:rPr>
+        <w:t>Tombol</w:t>
+      </w:r>
+      <w:proofErr w:type="spellEnd"/>
+      <w:r>
+        <w:rPr>
+          <w:sz w:val="24"/>
+          <w:szCs w:val="24"/>
+          <w:lang w:val="en-US"/>
+        </w:rPr>
+        <w:t xml:space="preserve"> [ + </w:t>
+      </w:r>
+      <w:proofErr w:type="spellStart"/>
+      <w:r>
+        <w:rPr>
+          <w:sz w:val="24"/>
+          <w:szCs w:val="24"/>
+          <w:lang w:val="en-US"/>
+        </w:rPr>
+        <w:t>Tambah</w:t>
+      </w:r>
+      <w:proofErr w:type="spellEnd"/>
+      <w:r>
+        <w:rPr>
+          <w:sz w:val="24"/>
+          <w:szCs w:val="24"/>
+          <w:lang w:val="en-US"/>
+        </w:rPr>
+        <w:t xml:space="preserve"> Non </w:t>
+      </w:r>
+      <w:proofErr w:type="gramStart"/>
+      <w:r>
+        <w:rPr>
+          <w:sz w:val="24"/>
+          <w:szCs w:val="24"/>
+          <w:lang w:val="en-US"/>
+        </w:rPr>
+        <w:t>Customer ]</w:t>
+      </w:r>
+      <w:proofErr w:type="gramEnd"/>
+      <w:r>
+        <w:rPr>
+          <w:sz w:val="24"/>
+          <w:szCs w:val="24"/>
+          <w:lang w:val="en-US"/>
+        </w:rPr>
+        <w:t xml:space="preserve"> </w:t>
+      </w:r>
+      <w:proofErr w:type="spellStart"/>
+      <w:r>
+        <w:rPr>
+          <w:sz w:val="24"/>
+          <w:szCs w:val="24"/>
+          <w:lang w:val="en-US"/>
+        </w:rPr>
+        <w:t>memunculkan</w:t>
+      </w:r>
+      <w:proofErr w:type="spellEnd"/>
+      <w:r>
+        <w:rPr>
+          <w:sz w:val="24"/>
+          <w:szCs w:val="24"/>
+          <w:lang w:val="en-US"/>
+        </w:rPr>
+        <w:t xml:space="preserve"> Pop-up Modal Form </w:t>
+      </w:r>
+      <w:proofErr w:type="spellStart"/>
+      <w:r>
+        <w:rPr>
+          <w:sz w:val="24"/>
+          <w:szCs w:val="24"/>
+          <w:lang w:val="en-US"/>
+        </w:rPr>
+        <w:t>berstruktur</w:t>
+      </w:r>
+      <w:proofErr w:type="spellEnd"/>
+      <w:r>
+        <w:rPr>
+          <w:sz w:val="24"/>
+          <w:szCs w:val="24"/>
+          <w:lang w:val="en-US"/>
+        </w:rPr>
+        <w:t xml:space="preserve"> Header Info, Alamat </w:t>
+      </w:r>
+      <w:proofErr w:type="spellStart"/>
+      <w:r>
+        <w:rPr>
+          <w:sz w:val="24"/>
+          <w:szCs w:val="24"/>
+          <w:lang w:val="en-US"/>
+        </w:rPr>
+        <w:t>Lengkap</w:t>
+      </w:r>
+      <w:proofErr w:type="spellEnd"/>
+      <w:r>
+        <w:rPr>
+          <w:sz w:val="24"/>
+          <w:szCs w:val="24"/>
+          <w:lang w:val="en-US"/>
+        </w:rPr>
+        <w:t xml:space="preserve">, Kontak PIC, </w:t>
+      </w:r>
+      <w:proofErr w:type="spellStart"/>
+      <w:r>
+        <w:rPr>
+          <w:sz w:val="24"/>
+          <w:szCs w:val="24"/>
+          <w:lang w:val="en-US"/>
+        </w:rPr>
+        <w:t>serta</w:t>
+      </w:r>
+      <w:proofErr w:type="spellEnd"/>
+      <w:r>
+        <w:rPr>
+          <w:sz w:val="24"/>
+          <w:szCs w:val="24"/>
+          <w:lang w:val="en-US"/>
+        </w:rPr>
+        <w:t xml:space="preserve"> Sales </w:t>
+      </w:r>
+      <w:proofErr w:type="spellStart"/>
+      <w:r>
+        <w:rPr>
+          <w:sz w:val="24"/>
+          <w:szCs w:val="24"/>
+          <w:lang w:val="en-US"/>
+        </w:rPr>
+        <w:t>Penanggung</w:t>
+      </w:r>
+      <w:proofErr w:type="spellEnd"/>
+      <w:r>
+        <w:rPr>
+          <w:sz w:val="24"/>
+          <w:szCs w:val="24"/>
+          <w:lang w:val="en-US"/>
+        </w:rPr>
+        <w:t xml:space="preserve"> Jawab. Edit </w:t>
+      </w:r>
+      <w:proofErr w:type="spellStart"/>
+      <w:r>
+        <w:rPr>
+          <w:sz w:val="24"/>
+          <w:szCs w:val="24"/>
+          <w:lang w:val="en-US"/>
+        </w:rPr>
+        <w:t>memunculkan</w:t>
+      </w:r>
+      <w:proofErr w:type="spellEnd"/>
+      <w:r>
+        <w:rPr>
+          <w:sz w:val="24"/>
+          <w:szCs w:val="24"/>
+          <w:lang w:val="en-US"/>
+        </w:rPr>
+        <w:t xml:space="preserve"> modal </w:t>
+      </w:r>
+      <w:proofErr w:type="spellStart"/>
+      <w:r>
+        <w:rPr>
+          <w:sz w:val="24"/>
+          <w:szCs w:val="24"/>
+          <w:lang w:val="en-US"/>
+        </w:rPr>
+        <w:t>terisi</w:t>
+      </w:r>
+      <w:proofErr w:type="spellEnd"/>
+      <w:r>
+        <w:rPr>
+          <w:sz w:val="24"/>
+          <w:szCs w:val="24"/>
+          <w:lang w:val="en-US"/>
+        </w:rPr>
+        <w:t xml:space="preserve">, Hapus </w:t>
+      </w:r>
+      <w:proofErr w:type="spellStart"/>
+      <w:r>
+        <w:rPr>
+          <w:sz w:val="24"/>
+          <w:szCs w:val="24"/>
+          <w:lang w:val="en-US"/>
+        </w:rPr>
+        <w:t>memunculkan</w:t>
+      </w:r>
+      <w:proofErr w:type="spellEnd"/>
+      <w:r>
+        <w:rPr>
+          <w:sz w:val="24"/>
+          <w:szCs w:val="24"/>
+          <w:lang w:val="en-US"/>
+        </w:rPr>
+        <w:t xml:space="preserve"> alert </w:t>
+      </w:r>
+      <w:proofErr w:type="spellStart"/>
+      <w:r>
+        <w:rPr>
+          <w:sz w:val="24"/>
+          <w:szCs w:val="24"/>
+          <w:lang w:val="en-US"/>
+        </w:rPr>
+        <w:t>konfirmasi</w:t>
+      </w:r>
+      <w:proofErr w:type="spellEnd"/>
+      <w:r>
+        <w:rPr>
+          <w:sz w:val="24"/>
+          <w:szCs w:val="24"/>
+          <w:lang w:val="en-US"/>
+        </w:rPr>
+        <w:t>.</w:t>
       </w:r>
     </w:p>
     <w:p/>
@@ -7612,41 +9266,15 @@
           <w:szCs w:val="24"/>
           <w:lang w:val="en-US"/>
         </w:rPr>
-        <w:t xml:space="preserve">Dashboard </w:t>
-      </w:r>
-      <w:r>
-        <w:rPr>
-          <w:b/>
-          <w:bCs/>
-          <w:sz w:val="24"/>
-          <w:szCs w:val="24"/>
-          <w:lang w:val="en-US"/>
-        </w:rPr>
-        <w:t>Production Proses</w:t>
-      </w:r>
-      <w:r>
-        <w:rPr>
-          <w:sz w:val="24"/>
-          <w:szCs w:val="24"/>
-          <w:lang w:val="en-US"/>
-        </w:rPr>
-        <w:t xml:space="preserve"> `</w:t>
-      </w:r>
-      <w:r>
-        <w:rPr>
-          <w:sz w:val="24"/>
-          <w:szCs w:val="24"/>
-          <w:lang w:val="en-US"/>
-        </w:rPr>
-        <w:t>production-process-dashboard</w:t>
-      </w:r>
-      <w:r>
-        <w:rPr>
-          <w:sz w:val="24"/>
-          <w:szCs w:val="24"/>
-          <w:lang w:val="en-US"/>
-        </w:rPr>
-        <w:t>`</w:t>
+        <w:t xml:space="preserve">Marketing Visit </w:t>
+      </w:r>
+      <w:r>
+        <w:rPr>
+          <w:sz w:val="24"/>
+          <w:szCs w:val="24"/>
+          <w:lang w:val="en-US"/>
+        </w:rPr>
+        <w:t>`marketing-visit`</w:t>
       </w:r>
     </w:p>
     <w:p>
@@ -7693,6 +9321,32 @@
         </w:rPr>
         <w:t xml:space="preserve"> </w:t>
       </w:r>
+      <w:r>
+        <w:rPr>
+          <w:sz w:val="24"/>
+          <w:szCs w:val="24"/>
+          <w:lang w:val="en-US"/>
+        </w:rPr>
+        <w:t xml:space="preserve">Date, Hari, ID, Name, </w:t>
+      </w:r>
+      <w:proofErr w:type="spellStart"/>
+      <w:r>
+        <w:rPr>
+          <w:sz w:val="24"/>
+          <w:szCs w:val="24"/>
+          <w:lang w:val="en-US"/>
+        </w:rPr>
+        <w:t>Tipe</w:t>
+      </w:r>
+      <w:proofErr w:type="spellEnd"/>
+      <w:r>
+        <w:rPr>
+          <w:sz w:val="24"/>
+          <w:szCs w:val="24"/>
+          <w:lang w:val="en-US"/>
+        </w:rPr>
+        <w:t>, NOO</w:t>
+      </w:r>
     </w:p>
     <w:p>
       <w:pPr>
@@ -7740,6 +9394,348 @@
         </w:rPr>
         <w:t xml:space="preserve"> </w:t>
       </w:r>
+      <w:proofErr w:type="spellStart"/>
+      <w:r>
+        <w:rPr>
+          <w:sz w:val="24"/>
+          <w:szCs w:val="24"/>
+          <w:lang w:val="en-US"/>
+        </w:rPr>
+        <w:t>Mencatat</w:t>
+      </w:r>
+      <w:proofErr w:type="spellEnd"/>
+      <w:r>
+        <w:rPr>
+          <w:sz w:val="24"/>
+          <w:szCs w:val="24"/>
+          <w:lang w:val="en-US"/>
+        </w:rPr>
+        <w:t xml:space="preserve"> dan </w:t>
+      </w:r>
+      <w:proofErr w:type="spellStart"/>
+      <w:r>
+        <w:rPr>
+          <w:sz w:val="24"/>
+          <w:szCs w:val="24"/>
+          <w:lang w:val="en-US"/>
+        </w:rPr>
+        <w:t>memantau</w:t>
+      </w:r>
+      <w:proofErr w:type="spellEnd"/>
+      <w:r>
+        <w:rPr>
+          <w:sz w:val="24"/>
+          <w:szCs w:val="24"/>
+          <w:lang w:val="en-US"/>
+        </w:rPr>
+        <w:t xml:space="preserve"> </w:t>
+      </w:r>
+      <w:proofErr w:type="spellStart"/>
+      <w:r>
+        <w:rPr>
+          <w:sz w:val="24"/>
+          <w:szCs w:val="24"/>
+          <w:lang w:val="en-US"/>
+        </w:rPr>
+        <w:t>aktivitas</w:t>
+      </w:r>
+      <w:proofErr w:type="spellEnd"/>
+      <w:r>
+        <w:rPr>
+          <w:sz w:val="24"/>
+          <w:szCs w:val="24"/>
+          <w:lang w:val="en-US"/>
+        </w:rPr>
+        <w:t xml:space="preserve"> </w:t>
+      </w:r>
+      <w:proofErr w:type="spellStart"/>
+      <w:r>
+        <w:rPr>
+          <w:sz w:val="24"/>
+          <w:szCs w:val="24"/>
+          <w:lang w:val="en-US"/>
+        </w:rPr>
+        <w:t>kunjungan</w:t>
+      </w:r>
+      <w:proofErr w:type="spellEnd"/>
+      <w:r>
+        <w:rPr>
+          <w:sz w:val="24"/>
+          <w:szCs w:val="24"/>
+          <w:lang w:val="en-US"/>
+        </w:rPr>
+        <w:t xml:space="preserve"> </w:t>
+      </w:r>
+      <w:proofErr w:type="spellStart"/>
+      <w:r>
+        <w:rPr>
+          <w:sz w:val="24"/>
+          <w:szCs w:val="24"/>
+          <w:lang w:val="en-US"/>
+        </w:rPr>
+        <w:t>harian</w:t>
+      </w:r>
+      <w:proofErr w:type="spellEnd"/>
+      <w:r>
+        <w:rPr>
+          <w:sz w:val="24"/>
+          <w:szCs w:val="24"/>
+          <w:lang w:val="en-US"/>
+        </w:rPr>
+        <w:t xml:space="preserve"> </w:t>
+      </w:r>
+      <w:proofErr w:type="spellStart"/>
+      <w:r>
+        <w:rPr>
+          <w:sz w:val="24"/>
+          <w:szCs w:val="24"/>
+          <w:lang w:val="en-US"/>
+        </w:rPr>
+        <w:t>tim</w:t>
+      </w:r>
+      <w:proofErr w:type="spellEnd"/>
+      <w:r>
+        <w:rPr>
+          <w:sz w:val="24"/>
+          <w:szCs w:val="24"/>
+          <w:lang w:val="en-US"/>
+        </w:rPr>
+        <w:t xml:space="preserve"> marketing/sales </w:t>
+      </w:r>
+      <w:proofErr w:type="spellStart"/>
+      <w:r>
+        <w:rPr>
+          <w:sz w:val="24"/>
+          <w:szCs w:val="24"/>
+          <w:lang w:val="en-US"/>
+        </w:rPr>
+        <w:t>ke</w:t>
+      </w:r>
+      <w:proofErr w:type="spellEnd"/>
+      <w:r>
+        <w:rPr>
+          <w:sz w:val="24"/>
+          <w:szCs w:val="24"/>
+          <w:lang w:val="en-US"/>
+        </w:rPr>
+        <w:t xml:space="preserve"> </w:t>
+      </w:r>
+      <w:proofErr w:type="spellStart"/>
+      <w:r>
+        <w:rPr>
+          <w:sz w:val="24"/>
+          <w:szCs w:val="24"/>
+          <w:lang w:val="en-US"/>
+        </w:rPr>
+        <w:t>lokasi</w:t>
+      </w:r>
+      <w:proofErr w:type="spellEnd"/>
+      <w:r>
+        <w:rPr>
+          <w:sz w:val="24"/>
+          <w:szCs w:val="24"/>
+          <w:lang w:val="en-US"/>
+        </w:rPr>
+        <w:t xml:space="preserve"> </w:t>
+      </w:r>
+      <w:proofErr w:type="spellStart"/>
+      <w:r>
+        <w:rPr>
+          <w:sz w:val="24"/>
+          <w:szCs w:val="24"/>
+          <w:lang w:val="en-US"/>
+        </w:rPr>
+        <w:t>prospek</w:t>
+      </w:r>
+      <w:proofErr w:type="spellEnd"/>
+      <w:r>
+        <w:rPr>
+          <w:sz w:val="24"/>
+          <w:szCs w:val="24"/>
+          <w:lang w:val="en-US"/>
+        </w:rPr>
+        <w:t xml:space="preserve"> </w:t>
+      </w:r>
+      <w:proofErr w:type="spellStart"/>
+      <w:r>
+        <w:rPr>
+          <w:sz w:val="24"/>
+          <w:szCs w:val="24"/>
+          <w:lang w:val="en-US"/>
+        </w:rPr>
+        <w:t>atau</w:t>
+      </w:r>
+      <w:proofErr w:type="spellEnd"/>
+      <w:r>
+        <w:rPr>
+          <w:sz w:val="24"/>
+          <w:szCs w:val="24"/>
+          <w:lang w:val="en-US"/>
+        </w:rPr>
+        <w:t xml:space="preserve"> </w:t>
+      </w:r>
+      <w:proofErr w:type="spellStart"/>
+      <w:r>
+        <w:rPr>
+          <w:sz w:val="24"/>
+          <w:szCs w:val="24"/>
+          <w:lang w:val="en-US"/>
+        </w:rPr>
+        <w:t>pelanggan</w:t>
+      </w:r>
+      <w:proofErr w:type="spellEnd"/>
+      <w:r>
+        <w:rPr>
+          <w:sz w:val="24"/>
+          <w:szCs w:val="24"/>
+          <w:lang w:val="en-US"/>
+        </w:rPr>
+        <w:t xml:space="preserve">, </w:t>
+      </w:r>
+      <w:proofErr w:type="spellStart"/>
+      <w:r>
+        <w:rPr>
+          <w:sz w:val="24"/>
+          <w:szCs w:val="24"/>
+          <w:lang w:val="en-US"/>
+        </w:rPr>
+        <w:t>serta</w:t>
+      </w:r>
+      <w:proofErr w:type="spellEnd"/>
+      <w:r>
+        <w:rPr>
+          <w:sz w:val="24"/>
+          <w:szCs w:val="24"/>
+          <w:lang w:val="en-US"/>
+        </w:rPr>
+        <w:t xml:space="preserve"> </w:t>
+      </w:r>
+      <w:proofErr w:type="spellStart"/>
+      <w:r>
+        <w:rPr>
+          <w:sz w:val="24"/>
+          <w:szCs w:val="24"/>
+          <w:lang w:val="en-US"/>
+        </w:rPr>
+        <w:t>mengidentifikasi</w:t>
+      </w:r>
+      <w:proofErr w:type="spellEnd"/>
+      <w:r>
+        <w:rPr>
+          <w:sz w:val="24"/>
+          <w:szCs w:val="24"/>
+          <w:lang w:val="en-US"/>
+        </w:rPr>
+        <w:t xml:space="preserve"> </w:t>
+      </w:r>
+      <w:proofErr w:type="spellStart"/>
+      <w:r>
+        <w:rPr>
+          <w:sz w:val="24"/>
+          <w:szCs w:val="24"/>
+          <w:lang w:val="en-US"/>
+        </w:rPr>
+        <w:t>hasil</w:t>
+      </w:r>
+      <w:proofErr w:type="spellEnd"/>
+      <w:r>
+        <w:rPr>
+          <w:sz w:val="24"/>
+          <w:szCs w:val="24"/>
+          <w:lang w:val="en-US"/>
+        </w:rPr>
+        <w:t xml:space="preserve"> </w:t>
+      </w:r>
+      <w:proofErr w:type="spellStart"/>
+      <w:r>
+        <w:rPr>
+          <w:sz w:val="24"/>
+          <w:szCs w:val="24"/>
+          <w:lang w:val="en-US"/>
+        </w:rPr>
+        <w:t>kunjungan</w:t>
+      </w:r>
+      <w:proofErr w:type="spellEnd"/>
+      <w:r>
+        <w:rPr>
+          <w:sz w:val="24"/>
+          <w:szCs w:val="24"/>
+          <w:lang w:val="en-US"/>
+        </w:rPr>
+        <w:t xml:space="preserve"> </w:t>
+      </w:r>
+      <w:proofErr w:type="spellStart"/>
+      <w:r>
+        <w:rPr>
+          <w:sz w:val="24"/>
+          <w:szCs w:val="24"/>
+          <w:lang w:val="en-US"/>
+        </w:rPr>
+        <w:t>berupa</w:t>
+      </w:r>
+      <w:proofErr w:type="spellEnd"/>
+      <w:r>
+        <w:rPr>
+          <w:sz w:val="24"/>
+          <w:szCs w:val="24"/>
+          <w:lang w:val="en-US"/>
+        </w:rPr>
+        <w:t xml:space="preserve"> </w:t>
+      </w:r>
+      <w:proofErr w:type="spellStart"/>
+      <w:r>
+        <w:rPr>
+          <w:sz w:val="24"/>
+          <w:szCs w:val="24"/>
+          <w:lang w:val="en-US"/>
+        </w:rPr>
+        <w:t>pembukaan</w:t>
+      </w:r>
+      <w:proofErr w:type="spellEnd"/>
+      <w:r>
+        <w:rPr>
+          <w:sz w:val="24"/>
+          <w:szCs w:val="24"/>
+          <w:lang w:val="en-US"/>
+        </w:rPr>
+        <w:t xml:space="preserve"> </w:t>
+      </w:r>
+      <w:proofErr w:type="spellStart"/>
+      <w:r>
+        <w:rPr>
+          <w:sz w:val="24"/>
+          <w:szCs w:val="24"/>
+          <w:lang w:val="en-US"/>
+        </w:rPr>
+        <w:t>toko</w:t>
+      </w:r>
+      <w:proofErr w:type="spellEnd"/>
+      <w:r>
+        <w:rPr>
+          <w:sz w:val="24"/>
+          <w:szCs w:val="24"/>
+          <w:lang w:val="en-US"/>
+        </w:rPr>
+        <w:t xml:space="preserve">/outlet </w:t>
+      </w:r>
+      <w:proofErr w:type="spellStart"/>
+      <w:r>
+        <w:rPr>
+          <w:sz w:val="24"/>
+          <w:szCs w:val="24"/>
+          <w:lang w:val="en-US"/>
+        </w:rPr>
+        <w:t>baru</w:t>
+      </w:r>
+      <w:proofErr w:type="spellEnd"/>
+      <w:r>
+        <w:rPr>
+          <w:sz w:val="24"/>
+          <w:szCs w:val="24"/>
+          <w:lang w:val="en-US"/>
+        </w:rPr>
+        <w:t xml:space="preserve"> (NOO).</w:t>
+      </w:r>
     </w:p>
     <w:p>
       <w:pPr>
@@ -7781,11 +9777,363 @@
       </w:r>
       <w:r>
         <w:rPr>
-          <w:sz w:val="24"/>
-          <w:szCs w:val="24"/>
-          <w:lang w:val="en-US"/>
-        </w:rPr>
-        <w:t xml:space="preserve"> </w:t>
+          <w:b/>
+          <w:bCs/>
+          <w:sz w:val="24"/>
+          <w:szCs w:val="24"/>
+          <w:lang w:val="en-US"/>
+        </w:rPr>
+        <w:t xml:space="preserve"> </w:t>
+      </w:r>
+      <w:r>
+        <w:rPr>
+          <w:sz w:val="24"/>
+          <w:szCs w:val="24"/>
+          <w:lang w:val="en-US"/>
+        </w:rPr>
+        <w:t xml:space="preserve"> </w:t>
+      </w:r>
+      <w:proofErr w:type="spellStart"/>
+      <w:r>
+        <w:rPr>
+          <w:sz w:val="24"/>
+          <w:szCs w:val="24"/>
+          <w:lang w:val="en-US"/>
+        </w:rPr>
+        <w:t>Tampilan</w:t>
+      </w:r>
+      <w:proofErr w:type="spellEnd"/>
+      <w:r>
+        <w:rPr>
+          <w:sz w:val="24"/>
+          <w:szCs w:val="24"/>
+          <w:lang w:val="en-US"/>
+        </w:rPr>
+        <w:t xml:space="preserve"> </w:t>
+      </w:r>
+      <w:proofErr w:type="spellStart"/>
+      <w:r>
+        <w:rPr>
+          <w:sz w:val="24"/>
+          <w:szCs w:val="24"/>
+          <w:lang w:val="en-US"/>
+        </w:rPr>
+        <w:t>awal</w:t>
+      </w:r>
+      <w:proofErr w:type="spellEnd"/>
+      <w:r>
+        <w:rPr>
+          <w:sz w:val="24"/>
+          <w:szCs w:val="24"/>
+          <w:lang w:val="en-US"/>
+        </w:rPr>
+        <w:t xml:space="preserve"> </w:t>
+      </w:r>
+      <w:proofErr w:type="spellStart"/>
+      <w:r>
+        <w:rPr>
+          <w:sz w:val="24"/>
+          <w:szCs w:val="24"/>
+          <w:lang w:val="en-US"/>
+        </w:rPr>
+        <w:t>berupa</w:t>
+      </w:r>
+      <w:proofErr w:type="spellEnd"/>
+      <w:r>
+        <w:rPr>
+          <w:sz w:val="24"/>
+          <w:szCs w:val="24"/>
+          <w:lang w:val="en-US"/>
+        </w:rPr>
+        <w:t xml:space="preserve"> table log </w:t>
+      </w:r>
+      <w:proofErr w:type="spellStart"/>
+      <w:r>
+        <w:rPr>
+          <w:sz w:val="24"/>
+          <w:szCs w:val="24"/>
+          <w:lang w:val="en-US"/>
+        </w:rPr>
+        <w:t>kunjungan</w:t>
+      </w:r>
+      <w:proofErr w:type="spellEnd"/>
+      <w:r>
+        <w:rPr>
+          <w:sz w:val="24"/>
+          <w:szCs w:val="24"/>
+          <w:lang w:val="en-US"/>
+        </w:rPr>
+        <w:t xml:space="preserve"> </w:t>
+      </w:r>
+      <w:proofErr w:type="spellStart"/>
+      <w:r>
+        <w:rPr>
+          <w:sz w:val="24"/>
+          <w:szCs w:val="24"/>
+          <w:lang w:val="en-US"/>
+        </w:rPr>
+        <w:t>harian</w:t>
+      </w:r>
+      <w:proofErr w:type="spellEnd"/>
+      <w:r>
+        <w:rPr>
+          <w:sz w:val="24"/>
+          <w:szCs w:val="24"/>
+          <w:lang w:val="en-US"/>
+        </w:rPr>
+        <w:t xml:space="preserve"> </w:t>
+      </w:r>
+      <w:proofErr w:type="spellStart"/>
+      <w:r>
+        <w:rPr>
+          <w:sz w:val="24"/>
+          <w:szCs w:val="24"/>
+          <w:lang w:val="en-US"/>
+        </w:rPr>
+        <w:t>berpenanda</w:t>
+      </w:r>
+      <w:proofErr w:type="spellEnd"/>
+      <w:r>
+        <w:rPr>
+          <w:sz w:val="24"/>
+          <w:szCs w:val="24"/>
+          <w:lang w:val="en-US"/>
+        </w:rPr>
+        <w:t xml:space="preserve"> </w:t>
+      </w:r>
+      <w:proofErr w:type="spellStart"/>
+      <w:r>
+        <w:rPr>
+          <w:sz w:val="24"/>
+          <w:szCs w:val="24"/>
+          <w:lang w:val="en-US"/>
+        </w:rPr>
+        <w:t>indikator</w:t>
+      </w:r>
+      <w:proofErr w:type="spellEnd"/>
+      <w:r>
+        <w:rPr>
+          <w:sz w:val="24"/>
+          <w:szCs w:val="24"/>
+          <w:lang w:val="en-US"/>
+        </w:rPr>
+        <w:t xml:space="preserve"> status NOO (Ya/Tidak). </w:t>
+      </w:r>
+      <w:proofErr w:type="spellStart"/>
+      <w:r>
+        <w:rPr>
+          <w:sz w:val="24"/>
+          <w:szCs w:val="24"/>
+          <w:lang w:val="en-US"/>
+        </w:rPr>
+        <w:t>Tombol</w:t>
+      </w:r>
+      <w:proofErr w:type="spellEnd"/>
+      <w:r>
+        <w:rPr>
+          <w:sz w:val="24"/>
+          <w:szCs w:val="24"/>
+          <w:lang w:val="en-US"/>
+        </w:rPr>
+        <w:t xml:space="preserve"> </w:t>
+      </w:r>
+      <w:proofErr w:type="spellStart"/>
+      <w:r>
+        <w:rPr>
+          <w:sz w:val="24"/>
+          <w:szCs w:val="24"/>
+          <w:lang w:val="en-US"/>
+        </w:rPr>
+        <w:t>Tambah</w:t>
+      </w:r>
+      <w:proofErr w:type="spellEnd"/>
+      <w:r>
+        <w:rPr>
+          <w:sz w:val="24"/>
+          <w:szCs w:val="24"/>
+          <w:lang w:val="en-US"/>
+        </w:rPr>
+        <w:t xml:space="preserve"> </w:t>
+      </w:r>
+      <w:proofErr w:type="spellStart"/>
+      <w:r>
+        <w:rPr>
+          <w:sz w:val="24"/>
+          <w:szCs w:val="24"/>
+          <w:lang w:val="en-US"/>
+        </w:rPr>
+        <w:t>memunculkan</w:t>
+      </w:r>
+      <w:proofErr w:type="spellEnd"/>
+      <w:r>
+        <w:rPr>
+          <w:sz w:val="24"/>
+          <w:szCs w:val="24"/>
+          <w:lang w:val="en-US"/>
+        </w:rPr>
+        <w:t xml:space="preserve"> Modal Form input </w:t>
+      </w:r>
+      <w:proofErr w:type="spellStart"/>
+      <w:r>
+        <w:rPr>
+          <w:sz w:val="24"/>
+          <w:szCs w:val="24"/>
+          <w:lang w:val="en-US"/>
+        </w:rPr>
+        <w:t>Tanggal</w:t>
+      </w:r>
+      <w:proofErr w:type="spellEnd"/>
+      <w:r>
+        <w:rPr>
+          <w:sz w:val="24"/>
+          <w:szCs w:val="24"/>
+          <w:lang w:val="en-US"/>
+        </w:rPr>
+        <w:t xml:space="preserve">, Hari, Lookup </w:t>
+      </w:r>
+      <w:proofErr w:type="gramStart"/>
+      <w:r>
+        <w:rPr>
+          <w:sz w:val="24"/>
+          <w:szCs w:val="24"/>
+          <w:lang w:val="en-US"/>
+        </w:rPr>
+        <w:t>Non Customer</w:t>
+      </w:r>
+      <w:proofErr w:type="gramEnd"/>
+      <w:r>
+        <w:rPr>
+          <w:sz w:val="24"/>
+          <w:szCs w:val="24"/>
+          <w:lang w:val="en-US"/>
+        </w:rPr>
+        <w:t xml:space="preserve">/Customer ID, </w:t>
+      </w:r>
+      <w:proofErr w:type="spellStart"/>
+      <w:r>
+        <w:rPr>
+          <w:sz w:val="24"/>
+          <w:szCs w:val="24"/>
+          <w:lang w:val="en-US"/>
+        </w:rPr>
+        <w:t>Tipe</w:t>
+      </w:r>
+      <w:proofErr w:type="spellEnd"/>
+      <w:r>
+        <w:rPr>
+          <w:sz w:val="24"/>
+          <w:szCs w:val="24"/>
+          <w:lang w:val="en-US"/>
+        </w:rPr>
+        <w:t xml:space="preserve"> </w:t>
+      </w:r>
+      <w:proofErr w:type="spellStart"/>
+      <w:r>
+        <w:rPr>
+          <w:sz w:val="24"/>
+          <w:szCs w:val="24"/>
+          <w:lang w:val="en-US"/>
+        </w:rPr>
+        <w:t>Kunjungan</w:t>
+      </w:r>
+      <w:proofErr w:type="spellEnd"/>
+      <w:r>
+        <w:rPr>
+          <w:sz w:val="24"/>
+          <w:szCs w:val="24"/>
+          <w:lang w:val="en-US"/>
+        </w:rPr>
+        <w:t xml:space="preserve"> (Canvas/Routine/</w:t>
+      </w:r>
+      <w:proofErr w:type="spellStart"/>
+      <w:r>
+        <w:rPr>
+          <w:sz w:val="24"/>
+          <w:szCs w:val="24"/>
+          <w:lang w:val="en-US"/>
+        </w:rPr>
+        <w:t>Prospeksi</w:t>
+      </w:r>
+      <w:proofErr w:type="spellEnd"/>
+      <w:r>
+        <w:rPr>
+          <w:sz w:val="24"/>
+          <w:szCs w:val="24"/>
+          <w:lang w:val="en-US"/>
+        </w:rPr>
+        <w:t xml:space="preserve">), dan Checkbox NOO. Edit </w:t>
+      </w:r>
+      <w:proofErr w:type="spellStart"/>
+      <w:r>
+        <w:rPr>
+          <w:sz w:val="24"/>
+          <w:szCs w:val="24"/>
+          <w:lang w:val="en-US"/>
+        </w:rPr>
+        <w:t>memunculkan</w:t>
+      </w:r>
+      <w:proofErr w:type="spellEnd"/>
+      <w:r>
+        <w:rPr>
+          <w:sz w:val="24"/>
+          <w:szCs w:val="24"/>
+          <w:lang w:val="en-US"/>
+        </w:rPr>
+        <w:t xml:space="preserve"> modal </w:t>
+      </w:r>
+      <w:proofErr w:type="spellStart"/>
+      <w:r>
+        <w:rPr>
+          <w:sz w:val="24"/>
+          <w:szCs w:val="24"/>
+          <w:lang w:val="en-US"/>
+        </w:rPr>
+        <w:t>terisi</w:t>
+      </w:r>
+      <w:proofErr w:type="spellEnd"/>
+      <w:r>
+        <w:rPr>
+          <w:sz w:val="24"/>
+          <w:szCs w:val="24"/>
+          <w:lang w:val="en-US"/>
+        </w:rPr>
+        <w:t xml:space="preserve">, Hapus </w:t>
+      </w:r>
+      <w:proofErr w:type="spellStart"/>
+      <w:r>
+        <w:rPr>
+          <w:sz w:val="24"/>
+          <w:szCs w:val="24"/>
+          <w:lang w:val="en-US"/>
+        </w:rPr>
+        <w:t>memunculkan</w:t>
+      </w:r>
+      <w:proofErr w:type="spellEnd"/>
+      <w:r>
+        <w:rPr>
+          <w:sz w:val="24"/>
+          <w:szCs w:val="24"/>
+          <w:lang w:val="en-US"/>
+        </w:rPr>
+        <w:t xml:space="preserve"> alert </w:t>
+      </w:r>
+      <w:proofErr w:type="spellStart"/>
+      <w:r>
+        <w:rPr>
+          <w:sz w:val="24"/>
+          <w:szCs w:val="24"/>
+          <w:lang w:val="en-US"/>
+        </w:rPr>
+        <w:t>konfirmasi</w:t>
+      </w:r>
+      <w:proofErr w:type="spellEnd"/>
+      <w:r>
+        <w:rPr>
+          <w:sz w:val="24"/>
+          <w:szCs w:val="24"/>
+          <w:lang w:val="en-US"/>
+        </w:rPr>
+        <w:t>.</w:t>
       </w:r>
     </w:p>
     <w:p/>

</xml_diff>

<commit_message>
feat: add Index Komisi Collection CRUD with 8 rule tiers
</commit_message>
<xml_diff>
--- a/blueprint/DRAFT_Blueprint_ERP_Marketing_CWA.docx
+++ b/blueprint/DRAFT_Blueprint_ERP_Marketing_CWA.docx
@@ -8203,6 +8203,59 @@
     </w:p>
     <w:p>
       <w:pPr>
+        <w:spacing w:line="360" w:lineRule="auto"/>
+        <w:ind w:left="1728"/>
+        <w:rPr>
+          <w:sz w:val="24"/>
+          <w:szCs w:val="24"/>
+          <w:lang w:val="en-US"/>
+        </w:rPr>
+      </w:pPr>
+      <w:r>
+        <w:rPr>
+          <w:sz w:val="24"/>
+          <w:szCs w:val="24"/>
+          <w:lang w:val="en-US"/>
+        </w:rPr>
+        <w:drawing>
+          <wp:inline distT="0" distB="0" distL="0" distR="0" wp14:anchorId="0975DB37" wp14:editId="7555F4EE">
+            <wp:extent cx="5611495" cy="2509429"/>
+            <wp:effectExtent l="0" t="0" r="8255" b="5715"/>
+            <wp:docPr id="1567550751" name="Picture 1"/>
+            <wp:cNvGraphicFramePr>
+              <a:graphicFrameLocks xmlns:a="http://schemas.openxmlformats.org/drawingml/2006/main" noChangeAspect="1"/>
+            </wp:cNvGraphicFramePr>
+            <a:graphic xmlns:a="http://schemas.openxmlformats.org/drawingml/2006/main">
+              <a:graphicData uri="http://schemas.openxmlformats.org/drawingml/2006/picture">
+                <pic:pic xmlns:pic="http://schemas.openxmlformats.org/drawingml/2006/picture">
+                  <pic:nvPicPr>
+                    <pic:cNvPr id="1567550751" name=""/>
+                    <pic:cNvPicPr/>
+                  </pic:nvPicPr>
+                  <pic:blipFill>
+                    <a:blip r:embed="rId10"/>
+                    <a:stretch>
+                      <a:fillRect/>
+                    </a:stretch>
+                  </pic:blipFill>
+                  <pic:spPr>
+                    <a:xfrm>
+                      <a:off x="0" y="0"/>
+                      <a:ext cx="5619180" cy="2512866"/>
+                    </a:xfrm>
+                    <a:prstGeom prst="rect">
+                      <a:avLst/>
+                    </a:prstGeom>
+                  </pic:spPr>
+                </pic:pic>
+              </a:graphicData>
+            </a:graphic>
+          </wp:inline>
+        </w:drawing>
+      </w:r>
+    </w:p>
+    <w:p>
+      <w:pPr>
         <w:pStyle w:val="Heading3"/>
         <w:numPr>
           <w:ilvl w:val="2"/>
@@ -8288,6 +8341,7 @@
           <w:szCs w:val="24"/>
           <w:lang w:val="en-US"/>
         </w:rPr>
+        <w:lastRenderedPageBreak/>
         <w:t>Komponen</w:t>
       </w:r>
       <w:proofErr w:type="spellEnd"/>
@@ -9222,6 +9276,114 @@
           <w:lang w:val="en-US"/>
         </w:rPr>
         <w:t>.</w:t>
+      </w:r>
+    </w:p>
+    <w:p>
+      <w:pPr>
+        <w:tabs>
+          <w:tab w:val="num" w:pos="2160"/>
+        </w:tabs>
+        <w:spacing w:line="360" w:lineRule="auto"/>
+        <w:ind w:left="1728"/>
+        <w:rPr>
+          <w:sz w:val="24"/>
+          <w:szCs w:val="24"/>
+          <w:lang w:val="en-US"/>
+        </w:rPr>
+      </w:pPr>
+      <w:r>
+        <w:rPr>
+          <w:noProof/>
+        </w:rPr>
+        <w:drawing>
+          <wp:inline distT="0" distB="0" distL="0" distR="0" wp14:anchorId="674D9A20" wp14:editId="0CBF51BD">
+            <wp:extent cx="5697220" cy="2508569"/>
+            <wp:effectExtent l="0" t="0" r="0" b="6350"/>
+            <wp:docPr id="1882804141" name="Picture 1"/>
+            <wp:cNvGraphicFramePr>
+              <a:graphicFrameLocks xmlns:a="http://schemas.openxmlformats.org/drawingml/2006/main" noChangeAspect="1"/>
+            </wp:cNvGraphicFramePr>
+            <a:graphic xmlns:a="http://schemas.openxmlformats.org/drawingml/2006/main">
+              <a:graphicData uri="http://schemas.openxmlformats.org/drawingml/2006/picture">
+                <pic:pic xmlns:pic="http://schemas.openxmlformats.org/drawingml/2006/picture">
+                  <pic:nvPicPr>
+                    <pic:cNvPr id="1882804141" name=""/>
+                    <pic:cNvPicPr/>
+                  </pic:nvPicPr>
+                  <pic:blipFill>
+                    <a:blip r:embed="rId11"/>
+                    <a:stretch>
+                      <a:fillRect/>
+                    </a:stretch>
+                  </pic:blipFill>
+                  <pic:spPr>
+                    <a:xfrm>
+                      <a:off x="0" y="0"/>
+                      <a:ext cx="5702210" cy="2510766"/>
+                    </a:xfrm>
+                    <a:prstGeom prst="rect">
+                      <a:avLst/>
+                    </a:prstGeom>
+                  </pic:spPr>
+                </pic:pic>
+              </a:graphicData>
+            </a:graphic>
+          </wp:inline>
+        </w:drawing>
+      </w:r>
+    </w:p>
+    <w:p>
+      <w:pPr>
+        <w:tabs>
+          <w:tab w:val="num" w:pos="2160"/>
+        </w:tabs>
+        <w:spacing w:line="360" w:lineRule="auto"/>
+        <w:ind w:left="1728"/>
+        <w:rPr>
+          <w:sz w:val="24"/>
+          <w:szCs w:val="24"/>
+          <w:lang w:val="en-US"/>
+        </w:rPr>
+      </w:pPr>
+      <w:r>
+        <w:rPr>
+          <w:noProof/>
+        </w:rPr>
+        <w:drawing>
+          <wp:inline distT="0" distB="0" distL="0" distR="0" wp14:anchorId="427BE4D9" wp14:editId="76B38A27">
+            <wp:extent cx="5135245" cy="3088855"/>
+            <wp:effectExtent l="0" t="0" r="8255" b="0"/>
+            <wp:docPr id="278240449" name="Picture 1"/>
+            <wp:cNvGraphicFramePr>
+              <a:graphicFrameLocks xmlns:a="http://schemas.openxmlformats.org/drawingml/2006/main" noChangeAspect="1"/>
+            </wp:cNvGraphicFramePr>
+            <a:graphic xmlns:a="http://schemas.openxmlformats.org/drawingml/2006/main">
+              <a:graphicData uri="http://schemas.openxmlformats.org/drawingml/2006/picture">
+                <pic:pic xmlns:pic="http://schemas.openxmlformats.org/drawingml/2006/picture">
+                  <pic:nvPicPr>
+                    <pic:cNvPr id="278240449" name=""/>
+                    <pic:cNvPicPr/>
+                  </pic:nvPicPr>
+                  <pic:blipFill>
+                    <a:blip r:embed="rId12"/>
+                    <a:stretch>
+                      <a:fillRect/>
+                    </a:stretch>
+                  </pic:blipFill>
+                  <pic:spPr>
+                    <a:xfrm>
+                      <a:off x="0" y="0"/>
+                      <a:ext cx="5145716" cy="3095153"/>
+                    </a:xfrm>
+                    <a:prstGeom prst="rect">
+                      <a:avLst/>
+                    </a:prstGeom>
+                  </pic:spPr>
+                </pic:pic>
+              </a:graphicData>
+            </a:graphic>
+          </wp:inline>
+        </w:drawing>
       </w:r>
     </w:p>
     <w:p/>
@@ -9373,6 +9535,7 @@
           <w:szCs w:val="24"/>
           <w:lang w:val="en-US"/>
         </w:rPr>
+        <w:lastRenderedPageBreak/>
         <w:t>Fungsi</w:t>
       </w:r>
       <w:proofErr w:type="spellEnd"/>
@@ -10134,6 +10297,114 @@
           <w:lang w:val="en-US"/>
         </w:rPr>
         <w:t>.</w:t>
+      </w:r>
+    </w:p>
+    <w:p>
+      <w:pPr>
+        <w:tabs>
+          <w:tab w:val="num" w:pos="2160"/>
+        </w:tabs>
+        <w:spacing w:line="360" w:lineRule="auto"/>
+        <w:ind w:left="1728"/>
+        <w:rPr>
+          <w:sz w:val="24"/>
+          <w:szCs w:val="24"/>
+          <w:lang w:val="en-US"/>
+        </w:rPr>
+      </w:pPr>
+      <w:r>
+        <w:rPr>
+          <w:noProof/>
+        </w:rPr>
+        <w:drawing>
+          <wp:inline distT="0" distB="0" distL="0" distR="0" wp14:anchorId="17DB0A11" wp14:editId="55B5D37D">
+            <wp:extent cx="5592445" cy="2461935"/>
+            <wp:effectExtent l="0" t="0" r="8255" b="0"/>
+            <wp:docPr id="1833757956" name="Picture 1"/>
+            <wp:cNvGraphicFramePr>
+              <a:graphicFrameLocks xmlns:a="http://schemas.openxmlformats.org/drawingml/2006/main" noChangeAspect="1"/>
+            </wp:cNvGraphicFramePr>
+            <a:graphic xmlns:a="http://schemas.openxmlformats.org/drawingml/2006/main">
+              <a:graphicData uri="http://schemas.openxmlformats.org/drawingml/2006/picture">
+                <pic:pic xmlns:pic="http://schemas.openxmlformats.org/drawingml/2006/picture">
+                  <pic:nvPicPr>
+                    <pic:cNvPr id="1833757956" name=""/>
+                    <pic:cNvPicPr/>
+                  </pic:nvPicPr>
+                  <pic:blipFill>
+                    <a:blip r:embed="rId13"/>
+                    <a:stretch>
+                      <a:fillRect/>
+                    </a:stretch>
+                  </pic:blipFill>
+                  <pic:spPr>
+                    <a:xfrm>
+                      <a:off x="0" y="0"/>
+                      <a:ext cx="5595993" cy="2463497"/>
+                    </a:xfrm>
+                    <a:prstGeom prst="rect">
+                      <a:avLst/>
+                    </a:prstGeom>
+                  </pic:spPr>
+                </pic:pic>
+              </a:graphicData>
+            </a:graphic>
+          </wp:inline>
+        </w:drawing>
+      </w:r>
+    </w:p>
+    <w:p>
+      <w:pPr>
+        <w:tabs>
+          <w:tab w:val="num" w:pos="2160"/>
+        </w:tabs>
+        <w:spacing w:line="360" w:lineRule="auto"/>
+        <w:ind w:left="1728"/>
+        <w:rPr>
+          <w:sz w:val="24"/>
+          <w:szCs w:val="24"/>
+          <w:lang w:val="en-US"/>
+        </w:rPr>
+      </w:pPr>
+      <w:r>
+        <w:rPr>
+          <w:noProof/>
+        </w:rPr>
+        <w:drawing>
+          <wp:inline distT="0" distB="0" distL="0" distR="0" wp14:anchorId="08A22255" wp14:editId="25793210">
+            <wp:extent cx="4142267" cy="2372678"/>
+            <wp:effectExtent l="0" t="0" r="0" b="8890"/>
+            <wp:docPr id="1336136803" name="Picture 1"/>
+            <wp:cNvGraphicFramePr>
+              <a:graphicFrameLocks xmlns:a="http://schemas.openxmlformats.org/drawingml/2006/main" noChangeAspect="1"/>
+            </wp:cNvGraphicFramePr>
+            <a:graphic xmlns:a="http://schemas.openxmlformats.org/drawingml/2006/main">
+              <a:graphicData uri="http://schemas.openxmlformats.org/drawingml/2006/picture">
+                <pic:pic xmlns:pic="http://schemas.openxmlformats.org/drawingml/2006/picture">
+                  <pic:nvPicPr>
+                    <pic:cNvPr id="1336136803" name=""/>
+                    <pic:cNvPicPr/>
+                  </pic:nvPicPr>
+                  <pic:blipFill>
+                    <a:blip r:embed="rId14"/>
+                    <a:stretch>
+                      <a:fillRect/>
+                    </a:stretch>
+                  </pic:blipFill>
+                  <pic:spPr>
+                    <a:xfrm>
+                      <a:off x="0" y="0"/>
+                      <a:ext cx="4148972" cy="2376519"/>
+                    </a:xfrm>
+                    <a:prstGeom prst="rect">
+                      <a:avLst/>
+                    </a:prstGeom>
+                  </pic:spPr>
+                </pic:pic>
+              </a:graphicData>
+            </a:graphic>
+          </wp:inline>
+        </w:drawing>
       </w:r>
     </w:p>
     <w:p/>
@@ -10178,41 +10449,15 @@
           <w:szCs w:val="24"/>
           <w:lang w:val="en-US"/>
         </w:rPr>
-        <w:t xml:space="preserve">Dashboard </w:t>
-      </w:r>
-      <w:r>
-        <w:rPr>
-          <w:b/>
-          <w:bCs/>
-          <w:sz w:val="24"/>
-          <w:szCs w:val="24"/>
-          <w:lang w:val="en-US"/>
-        </w:rPr>
-        <w:t>Production Proses</w:t>
-      </w:r>
-      <w:r>
-        <w:rPr>
-          <w:sz w:val="24"/>
-          <w:szCs w:val="24"/>
-          <w:lang w:val="en-US"/>
-        </w:rPr>
-        <w:t xml:space="preserve"> `</w:t>
-      </w:r>
-      <w:r>
-        <w:rPr>
-          <w:sz w:val="24"/>
-          <w:szCs w:val="24"/>
-          <w:lang w:val="en-US"/>
-        </w:rPr>
-        <w:t>production-process-dashboard</w:t>
-      </w:r>
-      <w:r>
-        <w:rPr>
-          <w:sz w:val="24"/>
-          <w:szCs w:val="24"/>
-          <w:lang w:val="en-US"/>
-        </w:rPr>
-        <w:t>`</w:t>
+        <w:t xml:space="preserve">New Customer Incentive </w:t>
+      </w:r>
+      <w:r>
+        <w:rPr>
+          <w:sz w:val="24"/>
+          <w:szCs w:val="24"/>
+          <w:lang w:val="en-US"/>
+        </w:rPr>
+        <w:t>`new-customer-incentive`</w:t>
       </w:r>
     </w:p>
     <w:p>
@@ -10259,6 +10504,68 @@
         </w:rPr>
         <w:t xml:space="preserve"> </w:t>
       </w:r>
+      <w:r>
+        <w:rPr>
+          <w:sz w:val="24"/>
+          <w:szCs w:val="24"/>
+          <w:lang w:val="en-US"/>
+        </w:rPr>
+        <w:t xml:space="preserve">TA, Sales, Customer, </w:t>
+      </w:r>
+      <w:proofErr w:type="spellStart"/>
+      <w:r>
+        <w:rPr>
+          <w:sz w:val="24"/>
+          <w:szCs w:val="24"/>
+          <w:lang w:val="en-US"/>
+        </w:rPr>
+        <w:t>Pemilik</w:t>
+      </w:r>
+      <w:proofErr w:type="spellEnd"/>
+      <w:r>
+        <w:rPr>
+          <w:sz w:val="24"/>
+          <w:szCs w:val="24"/>
+          <w:lang w:val="en-US"/>
+        </w:rPr>
+        <w:t xml:space="preserve">, Alamat, City, </w:t>
+      </w:r>
+      <w:proofErr w:type="spellStart"/>
+      <w:r>
+        <w:rPr>
+          <w:sz w:val="24"/>
+          <w:szCs w:val="24"/>
+          <w:lang w:val="en-US"/>
+        </w:rPr>
+        <w:t>Insentif</w:t>
+      </w:r>
+      <w:proofErr w:type="spellEnd"/>
+      <w:r>
+        <w:rPr>
+          <w:sz w:val="24"/>
+          <w:szCs w:val="24"/>
+          <w:lang w:val="en-US"/>
+        </w:rPr>
+        <w:t xml:space="preserve"> Sales, </w:t>
+      </w:r>
+      <w:proofErr w:type="spellStart"/>
+      <w:r>
+        <w:rPr>
+          <w:sz w:val="24"/>
+          <w:szCs w:val="24"/>
+          <w:lang w:val="en-US"/>
+        </w:rPr>
+        <w:t>Insentif</w:t>
+      </w:r>
+      <w:proofErr w:type="spellEnd"/>
+      <w:r>
+        <w:rPr>
+          <w:sz w:val="24"/>
+          <w:szCs w:val="24"/>
+          <w:lang w:val="en-US"/>
+        </w:rPr>
+        <w:t xml:space="preserve"> BDH, Bonus DOS, Total</w:t>
+      </w:r>
     </w:p>
     <w:p>
       <w:pPr>
@@ -10306,6 +10613,186 @@
         </w:rPr>
         <w:t xml:space="preserve"> </w:t>
       </w:r>
+      <w:proofErr w:type="spellStart"/>
+      <w:r>
+        <w:rPr>
+          <w:sz w:val="24"/>
+          <w:szCs w:val="24"/>
+          <w:lang w:val="en-US"/>
+        </w:rPr>
+        <w:t>Menghitung</w:t>
+      </w:r>
+      <w:proofErr w:type="spellEnd"/>
+      <w:r>
+        <w:rPr>
+          <w:sz w:val="24"/>
+          <w:szCs w:val="24"/>
+          <w:lang w:val="en-US"/>
+        </w:rPr>
+        <w:t xml:space="preserve"> dan </w:t>
+      </w:r>
+      <w:proofErr w:type="spellStart"/>
+      <w:r>
+        <w:rPr>
+          <w:sz w:val="24"/>
+          <w:szCs w:val="24"/>
+          <w:lang w:val="en-US"/>
+        </w:rPr>
+        <w:t>mengelola</w:t>
+      </w:r>
+      <w:proofErr w:type="spellEnd"/>
+      <w:r>
+        <w:rPr>
+          <w:sz w:val="24"/>
+          <w:szCs w:val="24"/>
+          <w:lang w:val="en-US"/>
+        </w:rPr>
+        <w:t xml:space="preserve"> </w:t>
+      </w:r>
+      <w:proofErr w:type="spellStart"/>
+      <w:r>
+        <w:rPr>
+          <w:sz w:val="24"/>
+          <w:szCs w:val="24"/>
+          <w:lang w:val="en-US"/>
+        </w:rPr>
+        <w:t>alokasi</w:t>
+      </w:r>
+      <w:proofErr w:type="spellEnd"/>
+      <w:r>
+        <w:rPr>
+          <w:sz w:val="24"/>
+          <w:szCs w:val="24"/>
+          <w:lang w:val="en-US"/>
+        </w:rPr>
+        <w:t xml:space="preserve"> </w:t>
+      </w:r>
+      <w:proofErr w:type="spellStart"/>
+      <w:r>
+        <w:rPr>
+          <w:sz w:val="24"/>
+          <w:szCs w:val="24"/>
+          <w:lang w:val="en-US"/>
+        </w:rPr>
+        <w:t>insentif</w:t>
+      </w:r>
+      <w:proofErr w:type="spellEnd"/>
+      <w:r>
+        <w:rPr>
+          <w:sz w:val="24"/>
+          <w:szCs w:val="24"/>
+          <w:lang w:val="en-US"/>
+        </w:rPr>
+        <w:t xml:space="preserve"> </w:t>
+      </w:r>
+      <w:proofErr w:type="spellStart"/>
+      <w:r>
+        <w:rPr>
+          <w:sz w:val="24"/>
+          <w:szCs w:val="24"/>
+          <w:lang w:val="en-US"/>
+        </w:rPr>
+        <w:t>atas</w:t>
+      </w:r>
+      <w:proofErr w:type="spellEnd"/>
+      <w:r>
+        <w:rPr>
+          <w:sz w:val="24"/>
+          <w:szCs w:val="24"/>
+          <w:lang w:val="en-US"/>
+        </w:rPr>
+        <w:t xml:space="preserve"> </w:t>
+      </w:r>
+      <w:proofErr w:type="spellStart"/>
+      <w:r>
+        <w:rPr>
+          <w:sz w:val="24"/>
+          <w:szCs w:val="24"/>
+          <w:lang w:val="en-US"/>
+        </w:rPr>
+        <w:t>keberhasilan</w:t>
+      </w:r>
+      <w:proofErr w:type="spellEnd"/>
+      <w:r>
+        <w:rPr>
+          <w:sz w:val="24"/>
+          <w:szCs w:val="24"/>
+          <w:lang w:val="en-US"/>
+        </w:rPr>
+        <w:t xml:space="preserve"> </w:t>
+      </w:r>
+      <w:proofErr w:type="spellStart"/>
+      <w:r>
+        <w:rPr>
+          <w:sz w:val="24"/>
+          <w:szCs w:val="24"/>
+          <w:lang w:val="en-US"/>
+        </w:rPr>
+        <w:t>akuisisi</w:t>
+      </w:r>
+      <w:proofErr w:type="spellEnd"/>
+      <w:r>
+        <w:rPr>
+          <w:sz w:val="24"/>
+          <w:szCs w:val="24"/>
+          <w:lang w:val="en-US"/>
+        </w:rPr>
+        <w:t xml:space="preserve"> </w:t>
+      </w:r>
+      <w:proofErr w:type="spellStart"/>
+      <w:r>
+        <w:rPr>
+          <w:sz w:val="24"/>
+          <w:szCs w:val="24"/>
+          <w:lang w:val="en-US"/>
+        </w:rPr>
+        <w:t>pelanggan</w:t>
+      </w:r>
+      <w:proofErr w:type="spellEnd"/>
+      <w:r>
+        <w:rPr>
+          <w:sz w:val="24"/>
+          <w:szCs w:val="24"/>
+          <w:lang w:val="en-US"/>
+        </w:rPr>
+        <w:t xml:space="preserve"> </w:t>
+      </w:r>
+      <w:proofErr w:type="spellStart"/>
+      <w:r>
+        <w:rPr>
+          <w:sz w:val="24"/>
+          <w:szCs w:val="24"/>
+          <w:lang w:val="en-US"/>
+        </w:rPr>
+        <w:t>baru</w:t>
+      </w:r>
+      <w:proofErr w:type="spellEnd"/>
+      <w:r>
+        <w:rPr>
+          <w:sz w:val="24"/>
+          <w:szCs w:val="24"/>
+          <w:lang w:val="en-US"/>
+        </w:rPr>
+        <w:t xml:space="preserve"> (NOO) </w:t>
+      </w:r>
+      <w:proofErr w:type="spellStart"/>
+      <w:r>
+        <w:rPr>
+          <w:sz w:val="24"/>
+          <w:szCs w:val="24"/>
+          <w:lang w:val="en-US"/>
+        </w:rPr>
+        <w:t>bagi</w:t>
+      </w:r>
+      <w:proofErr w:type="spellEnd"/>
+      <w:r>
+        <w:rPr>
+          <w:sz w:val="24"/>
+          <w:szCs w:val="24"/>
+          <w:lang w:val="en-US"/>
+        </w:rPr>
+        <w:t xml:space="preserve"> Sales, BDH (Business Development Head), dan DOS (Director of Sales).</w:t>
+      </w:r>
     </w:p>
     <w:p>
       <w:pPr>
@@ -10352,6 +10839,385 @@
           <w:lang w:val="en-US"/>
         </w:rPr>
         <w:t xml:space="preserve"> </w:t>
+      </w:r>
+      <w:proofErr w:type="spellStart"/>
+      <w:r>
+        <w:rPr>
+          <w:sz w:val="24"/>
+          <w:szCs w:val="24"/>
+          <w:lang w:val="en-US"/>
+        </w:rPr>
+        <w:t>Tampilan</w:t>
+      </w:r>
+      <w:proofErr w:type="spellEnd"/>
+      <w:r>
+        <w:rPr>
+          <w:sz w:val="24"/>
+          <w:szCs w:val="24"/>
+          <w:lang w:val="en-US"/>
+        </w:rPr>
+        <w:t xml:space="preserve"> </w:t>
+      </w:r>
+      <w:proofErr w:type="spellStart"/>
+      <w:r>
+        <w:rPr>
+          <w:sz w:val="24"/>
+          <w:szCs w:val="24"/>
+          <w:lang w:val="en-US"/>
+        </w:rPr>
+        <w:t>awal</w:t>
+      </w:r>
+      <w:proofErr w:type="spellEnd"/>
+      <w:r>
+        <w:rPr>
+          <w:sz w:val="24"/>
+          <w:szCs w:val="24"/>
+          <w:lang w:val="en-US"/>
+        </w:rPr>
+        <w:t xml:space="preserve"> </w:t>
+      </w:r>
+      <w:proofErr w:type="spellStart"/>
+      <w:r>
+        <w:rPr>
+          <w:sz w:val="24"/>
+          <w:szCs w:val="24"/>
+          <w:lang w:val="en-US"/>
+        </w:rPr>
+        <w:t>berupa</w:t>
+      </w:r>
+      <w:proofErr w:type="spellEnd"/>
+      <w:r>
+        <w:rPr>
+          <w:sz w:val="24"/>
+          <w:szCs w:val="24"/>
+          <w:lang w:val="en-US"/>
+        </w:rPr>
+        <w:t xml:space="preserve"> table data grid </w:t>
+      </w:r>
+      <w:proofErr w:type="spellStart"/>
+      <w:r>
+        <w:rPr>
+          <w:sz w:val="24"/>
+          <w:szCs w:val="24"/>
+          <w:lang w:val="en-US"/>
+        </w:rPr>
+        <w:t>rekapitulasi</w:t>
+      </w:r>
+      <w:proofErr w:type="spellEnd"/>
+      <w:r>
+        <w:rPr>
+          <w:sz w:val="24"/>
+          <w:szCs w:val="24"/>
+          <w:lang w:val="en-US"/>
+        </w:rPr>
+        <w:t xml:space="preserve"> </w:t>
+      </w:r>
+      <w:proofErr w:type="spellStart"/>
+      <w:r>
+        <w:rPr>
+          <w:sz w:val="24"/>
+          <w:szCs w:val="24"/>
+          <w:lang w:val="en-US"/>
+        </w:rPr>
+        <w:t>insentif</w:t>
+      </w:r>
+      <w:proofErr w:type="spellEnd"/>
+      <w:r>
+        <w:rPr>
+          <w:sz w:val="24"/>
+          <w:szCs w:val="24"/>
+          <w:lang w:val="en-US"/>
+        </w:rPr>
+        <w:t xml:space="preserve"> NOO per area/depo. </w:t>
+      </w:r>
+      <w:proofErr w:type="spellStart"/>
+      <w:r>
+        <w:rPr>
+          <w:sz w:val="24"/>
+          <w:szCs w:val="24"/>
+          <w:lang w:val="en-US"/>
+        </w:rPr>
+        <w:t>Tombol</w:t>
+      </w:r>
+      <w:proofErr w:type="spellEnd"/>
+      <w:r>
+        <w:rPr>
+          <w:sz w:val="24"/>
+          <w:szCs w:val="24"/>
+          <w:lang w:val="en-US"/>
+        </w:rPr>
+        <w:t xml:space="preserve"> </w:t>
+      </w:r>
+      <w:proofErr w:type="spellStart"/>
+      <w:r>
+        <w:rPr>
+          <w:sz w:val="24"/>
+          <w:szCs w:val="24"/>
+          <w:lang w:val="en-US"/>
+        </w:rPr>
+        <w:t>Tambah</w:t>
+      </w:r>
+      <w:proofErr w:type="spellEnd"/>
+      <w:r>
+        <w:rPr>
+          <w:sz w:val="24"/>
+          <w:szCs w:val="24"/>
+          <w:lang w:val="en-US"/>
+        </w:rPr>
+        <w:t xml:space="preserve"> </w:t>
+      </w:r>
+      <w:proofErr w:type="spellStart"/>
+      <w:r>
+        <w:rPr>
+          <w:sz w:val="24"/>
+          <w:szCs w:val="24"/>
+          <w:lang w:val="en-US"/>
+        </w:rPr>
+        <w:t>memunculkan</w:t>
+      </w:r>
+      <w:proofErr w:type="spellEnd"/>
+      <w:r>
+        <w:rPr>
+          <w:sz w:val="24"/>
+          <w:szCs w:val="24"/>
+          <w:lang w:val="en-US"/>
+        </w:rPr>
+        <w:t xml:space="preserve"> Modal Form </w:t>
+      </w:r>
+      <w:proofErr w:type="spellStart"/>
+      <w:r>
+        <w:rPr>
+          <w:sz w:val="24"/>
+          <w:szCs w:val="24"/>
+          <w:lang w:val="en-US"/>
+        </w:rPr>
+        <w:t>pemilihan</w:t>
+      </w:r>
+      <w:proofErr w:type="spellEnd"/>
+      <w:r>
+        <w:rPr>
+          <w:sz w:val="24"/>
+          <w:szCs w:val="24"/>
+          <w:lang w:val="en-US"/>
+        </w:rPr>
+        <w:t xml:space="preserve"> Transit Area (TA), Sales, dan Customer </w:t>
+      </w:r>
+      <w:proofErr w:type="spellStart"/>
+      <w:r>
+        <w:rPr>
+          <w:sz w:val="24"/>
+          <w:szCs w:val="24"/>
+          <w:lang w:val="en-US"/>
+        </w:rPr>
+        <w:lastRenderedPageBreak/>
+        <w:t>terkonversi</w:t>
+      </w:r>
+      <w:proofErr w:type="spellEnd"/>
+      <w:r>
+        <w:rPr>
+          <w:sz w:val="24"/>
+          <w:szCs w:val="24"/>
+          <w:lang w:val="en-US"/>
+        </w:rPr>
+        <w:t xml:space="preserve">, yang </w:t>
+      </w:r>
+      <w:proofErr w:type="spellStart"/>
+      <w:r>
+        <w:rPr>
+          <w:sz w:val="24"/>
+          <w:szCs w:val="24"/>
+          <w:lang w:val="en-US"/>
+        </w:rPr>
+        <w:t>secara</w:t>
+      </w:r>
+      <w:proofErr w:type="spellEnd"/>
+      <w:r>
+        <w:rPr>
+          <w:sz w:val="24"/>
+          <w:szCs w:val="24"/>
+          <w:lang w:val="en-US"/>
+        </w:rPr>
+        <w:t xml:space="preserve"> </w:t>
+      </w:r>
+      <w:proofErr w:type="spellStart"/>
+      <w:r>
+        <w:rPr>
+          <w:sz w:val="24"/>
+          <w:szCs w:val="24"/>
+          <w:lang w:val="en-US"/>
+        </w:rPr>
+        <w:t>otomatis</w:t>
+      </w:r>
+      <w:proofErr w:type="spellEnd"/>
+      <w:r>
+        <w:rPr>
+          <w:sz w:val="24"/>
+          <w:szCs w:val="24"/>
+          <w:lang w:val="en-US"/>
+        </w:rPr>
+        <w:t xml:space="preserve"> </w:t>
+      </w:r>
+      <w:proofErr w:type="spellStart"/>
+      <w:r>
+        <w:rPr>
+          <w:sz w:val="24"/>
+          <w:szCs w:val="24"/>
+          <w:lang w:val="en-US"/>
+        </w:rPr>
+        <w:t>menghitung</w:t>
+      </w:r>
+      <w:proofErr w:type="spellEnd"/>
+      <w:r>
+        <w:rPr>
+          <w:sz w:val="24"/>
+          <w:szCs w:val="24"/>
+          <w:lang w:val="en-US"/>
+        </w:rPr>
+        <w:t xml:space="preserve"> </w:t>
+      </w:r>
+      <w:proofErr w:type="spellStart"/>
+      <w:r>
+        <w:rPr>
+          <w:sz w:val="24"/>
+          <w:szCs w:val="24"/>
+          <w:lang w:val="en-US"/>
+        </w:rPr>
+        <w:t>proporsi</w:t>
+      </w:r>
+      <w:proofErr w:type="spellEnd"/>
+      <w:r>
+        <w:rPr>
+          <w:sz w:val="24"/>
+          <w:szCs w:val="24"/>
+          <w:lang w:val="en-US"/>
+        </w:rPr>
+        <w:t xml:space="preserve"> </w:t>
+      </w:r>
+      <w:proofErr w:type="spellStart"/>
+      <w:r>
+        <w:rPr>
+          <w:sz w:val="24"/>
+          <w:szCs w:val="24"/>
+          <w:lang w:val="en-US"/>
+        </w:rPr>
+        <w:t>Insentif</w:t>
+      </w:r>
+      <w:proofErr w:type="spellEnd"/>
+      <w:r>
+        <w:rPr>
+          <w:sz w:val="24"/>
+          <w:szCs w:val="24"/>
+          <w:lang w:val="en-US"/>
+        </w:rPr>
+        <w:t xml:space="preserve"> Sales, BDH, dan DOS.</w:t>
+      </w:r>
+    </w:p>
+    <w:p>
+      <w:pPr>
+        <w:tabs>
+          <w:tab w:val="num" w:pos="2160"/>
+        </w:tabs>
+        <w:spacing w:line="360" w:lineRule="auto"/>
+        <w:ind w:left="1728"/>
+        <w:rPr>
+          <w:sz w:val="24"/>
+          <w:szCs w:val="24"/>
+          <w:lang w:val="en-US"/>
+        </w:rPr>
+      </w:pPr>
+      <w:r>
+        <w:rPr>
+          <w:noProof/>
+        </w:rPr>
+        <w:drawing>
+          <wp:inline distT="0" distB="0" distL="0" distR="0" wp14:anchorId="0214756C" wp14:editId="1CCEFEE0">
+            <wp:extent cx="5611495" cy="2486867"/>
+            <wp:effectExtent l="0" t="0" r="8255" b="8890"/>
+            <wp:docPr id="2010699686" name="Picture 1"/>
+            <wp:cNvGraphicFramePr>
+              <a:graphicFrameLocks xmlns:a="http://schemas.openxmlformats.org/drawingml/2006/main" noChangeAspect="1"/>
+            </wp:cNvGraphicFramePr>
+            <a:graphic xmlns:a="http://schemas.openxmlformats.org/drawingml/2006/main">
+              <a:graphicData uri="http://schemas.openxmlformats.org/drawingml/2006/picture">
+                <pic:pic xmlns:pic="http://schemas.openxmlformats.org/drawingml/2006/picture">
+                  <pic:nvPicPr>
+                    <pic:cNvPr id="2010699686" name=""/>
+                    <pic:cNvPicPr/>
+                  </pic:nvPicPr>
+                  <pic:blipFill>
+                    <a:blip r:embed="rId15"/>
+                    <a:stretch>
+                      <a:fillRect/>
+                    </a:stretch>
+                  </pic:blipFill>
+                  <pic:spPr>
+                    <a:xfrm>
+                      <a:off x="0" y="0"/>
+                      <a:ext cx="5619307" cy="2490329"/>
+                    </a:xfrm>
+                    <a:prstGeom prst="rect">
+                      <a:avLst/>
+                    </a:prstGeom>
+                  </pic:spPr>
+                </pic:pic>
+              </a:graphicData>
+            </a:graphic>
+          </wp:inline>
+        </w:drawing>
+      </w:r>
+    </w:p>
+    <w:p>
+      <w:pPr>
+        <w:tabs>
+          <w:tab w:val="num" w:pos="2160"/>
+        </w:tabs>
+        <w:spacing w:line="360" w:lineRule="auto"/>
+        <w:ind w:left="1728"/>
+        <w:rPr>
+          <w:sz w:val="24"/>
+          <w:szCs w:val="24"/>
+          <w:lang w:val="en-US"/>
+        </w:rPr>
+      </w:pPr>
+      <w:r>
+        <w:rPr>
+          <w:noProof/>
+        </w:rPr>
+        <w:drawing>
+          <wp:inline distT="0" distB="0" distL="0" distR="0" wp14:anchorId="55CE5DDB" wp14:editId="0A5CA645">
+            <wp:extent cx="4744720" cy="2820463"/>
+            <wp:effectExtent l="0" t="0" r="0" b="0"/>
+            <wp:docPr id="296972636" name="Picture 1"/>
+            <wp:cNvGraphicFramePr>
+              <a:graphicFrameLocks xmlns:a="http://schemas.openxmlformats.org/drawingml/2006/main" noChangeAspect="1"/>
+            </wp:cNvGraphicFramePr>
+            <a:graphic xmlns:a="http://schemas.openxmlformats.org/drawingml/2006/main">
+              <a:graphicData uri="http://schemas.openxmlformats.org/drawingml/2006/picture">
+                <pic:pic xmlns:pic="http://schemas.openxmlformats.org/drawingml/2006/picture">
+                  <pic:nvPicPr>
+                    <pic:cNvPr id="296972636" name=""/>
+                    <pic:cNvPicPr/>
+                  </pic:nvPicPr>
+                  <pic:blipFill>
+                    <a:blip r:embed="rId16"/>
+                    <a:stretch>
+                      <a:fillRect/>
+                    </a:stretch>
+                  </pic:blipFill>
+                  <pic:spPr>
+                    <a:xfrm>
+                      <a:off x="0" y="0"/>
+                      <a:ext cx="4755143" cy="2826659"/>
+                    </a:xfrm>
+                    <a:prstGeom prst="rect">
+                      <a:avLst/>
+                    </a:prstGeom>
+                  </pic:spPr>
+                </pic:pic>
+              </a:graphicData>
+            </a:graphic>
+          </wp:inline>
+        </w:drawing>
       </w:r>
     </w:p>
     <w:p/>
@@ -10396,8 +11262,9 @@
           <w:szCs w:val="24"/>
           <w:lang w:val="en-US"/>
         </w:rPr>
-        <w:t xml:space="preserve">Dashboard </w:t>
-      </w:r>
+        <w:t xml:space="preserve">Index </w:t>
+      </w:r>
+      <w:proofErr w:type="spellStart"/>
       <w:r>
         <w:rPr>
           <w:b/>
@@ -10406,31 +11273,44 @@
           <w:szCs w:val="24"/>
           <w:lang w:val="en-US"/>
         </w:rPr>
-        <w:t>Production Proses</w:t>
-      </w:r>
-      <w:r>
-        <w:rPr>
-          <w:sz w:val="24"/>
-          <w:szCs w:val="24"/>
-          <w:lang w:val="en-US"/>
-        </w:rPr>
-        <w:t xml:space="preserve"> `</w:t>
-      </w:r>
-      <w:r>
-        <w:rPr>
-          <w:sz w:val="24"/>
-          <w:szCs w:val="24"/>
-          <w:lang w:val="en-US"/>
-        </w:rPr>
-        <w:t>production-process-dashboard</w:t>
-      </w:r>
-      <w:r>
-        <w:rPr>
-          <w:sz w:val="24"/>
-          <w:szCs w:val="24"/>
-          <w:lang w:val="en-US"/>
-        </w:rPr>
-        <w:t>`</w:t>
+        <w:t>Komisi</w:t>
+      </w:r>
+      <w:proofErr w:type="spellEnd"/>
+      <w:r>
+        <w:rPr>
+          <w:b/>
+          <w:bCs/>
+          <w:sz w:val="24"/>
+          <w:szCs w:val="24"/>
+          <w:lang w:val="en-US"/>
+        </w:rPr>
+        <w:t xml:space="preserve"> Collection </w:t>
+      </w:r>
+      <w:r>
+        <w:rPr>
+          <w:sz w:val="24"/>
+          <w:szCs w:val="24"/>
+          <w:lang w:val="en-US"/>
+        </w:rPr>
+        <w:t>`index-</w:t>
+      </w:r>
+      <w:proofErr w:type="spellStart"/>
+      <w:r>
+        <w:rPr>
+          <w:sz w:val="24"/>
+          <w:szCs w:val="24"/>
+          <w:lang w:val="en-US"/>
+        </w:rPr>
+        <w:t>komisi</w:t>
+      </w:r>
+      <w:proofErr w:type="spellEnd"/>
+      <w:r>
+        <w:rPr>
+          <w:sz w:val="24"/>
+          <w:szCs w:val="24"/>
+          <w:lang w:val="en-US"/>
+        </w:rPr>
+        <w:t>-collection`</w:t>
       </w:r>
     </w:p>
     <w:p>
@@ -10477,6 +11357,14 @@
         </w:rPr>
         <w:t xml:space="preserve"> </w:t>
       </w:r>
+      <w:r>
+        <w:rPr>
+          <w:sz w:val="24"/>
+          <w:szCs w:val="24"/>
+          <w:lang w:val="en-US"/>
+        </w:rPr>
+        <w:t>Type, Min, Max, Index Commission</w:t>
+      </w:r>
     </w:p>
     <w:p>
       <w:pPr>
@@ -10524,6 +11412,204 @@
         </w:rPr>
         <w:t xml:space="preserve"> </w:t>
       </w:r>
+      <w:proofErr w:type="spellStart"/>
+      <w:r>
+        <w:rPr>
+          <w:sz w:val="24"/>
+          <w:szCs w:val="24"/>
+          <w:lang w:val="en-US"/>
+        </w:rPr>
+        <w:t>Menetapkan</w:t>
+      </w:r>
+      <w:proofErr w:type="spellEnd"/>
+      <w:r>
+        <w:rPr>
+          <w:sz w:val="24"/>
+          <w:szCs w:val="24"/>
+          <w:lang w:val="en-US"/>
+        </w:rPr>
+        <w:t xml:space="preserve"> </w:t>
+      </w:r>
+      <w:proofErr w:type="spellStart"/>
+      <w:r>
+        <w:rPr>
+          <w:sz w:val="24"/>
+          <w:szCs w:val="24"/>
+          <w:lang w:val="en-US"/>
+        </w:rPr>
+        <w:t>matriks</w:t>
+      </w:r>
+      <w:proofErr w:type="spellEnd"/>
+      <w:r>
+        <w:rPr>
+          <w:sz w:val="24"/>
+          <w:szCs w:val="24"/>
+          <w:lang w:val="en-US"/>
+        </w:rPr>
+        <w:t xml:space="preserve"> </w:t>
+      </w:r>
+      <w:proofErr w:type="spellStart"/>
+      <w:r>
+        <w:rPr>
+          <w:sz w:val="24"/>
+          <w:szCs w:val="24"/>
+          <w:lang w:val="en-US"/>
+        </w:rPr>
+        <w:t>acuan</w:t>
+      </w:r>
+      <w:proofErr w:type="spellEnd"/>
+      <w:r>
+        <w:rPr>
+          <w:sz w:val="24"/>
+          <w:szCs w:val="24"/>
+          <w:lang w:val="en-US"/>
+        </w:rPr>
+        <w:t xml:space="preserve"> </w:t>
+      </w:r>
+      <w:proofErr w:type="spellStart"/>
+      <w:r>
+        <w:rPr>
+          <w:sz w:val="24"/>
+          <w:szCs w:val="24"/>
+          <w:lang w:val="en-US"/>
+        </w:rPr>
+        <w:t>nilai</w:t>
+      </w:r>
+      <w:proofErr w:type="spellEnd"/>
+      <w:r>
+        <w:rPr>
+          <w:sz w:val="24"/>
+          <w:szCs w:val="24"/>
+          <w:lang w:val="en-US"/>
+        </w:rPr>
+        <w:t xml:space="preserve"> </w:t>
+      </w:r>
+      <w:proofErr w:type="spellStart"/>
+      <w:r>
+        <w:rPr>
+          <w:sz w:val="24"/>
+          <w:szCs w:val="24"/>
+          <w:lang w:val="en-US"/>
+        </w:rPr>
+        <w:t>indeks</w:t>
+      </w:r>
+      <w:proofErr w:type="spellEnd"/>
+      <w:r>
+        <w:rPr>
+          <w:sz w:val="24"/>
+          <w:szCs w:val="24"/>
+          <w:lang w:val="en-US"/>
+        </w:rPr>
+        <w:t xml:space="preserve"> </w:t>
+      </w:r>
+      <w:proofErr w:type="spellStart"/>
+      <w:r>
+        <w:rPr>
+          <w:sz w:val="24"/>
+          <w:szCs w:val="24"/>
+          <w:lang w:val="en-US"/>
+        </w:rPr>
+        <w:t>komisi</w:t>
+      </w:r>
+      <w:proofErr w:type="spellEnd"/>
+      <w:r>
+        <w:rPr>
+          <w:sz w:val="24"/>
+          <w:szCs w:val="24"/>
+          <w:lang w:val="en-US"/>
+        </w:rPr>
+        <w:t xml:space="preserve"> </w:t>
+      </w:r>
+      <w:proofErr w:type="spellStart"/>
+      <w:r>
+        <w:rPr>
+          <w:sz w:val="24"/>
+          <w:szCs w:val="24"/>
+          <w:lang w:val="en-US"/>
+        </w:rPr>
+        <w:t>berdasarkan</w:t>
+      </w:r>
+      <w:proofErr w:type="spellEnd"/>
+      <w:r>
+        <w:rPr>
+          <w:sz w:val="24"/>
+          <w:szCs w:val="24"/>
+          <w:lang w:val="en-US"/>
+        </w:rPr>
+        <w:t xml:space="preserve"> </w:t>
+      </w:r>
+      <w:proofErr w:type="spellStart"/>
+      <w:r>
+        <w:rPr>
+          <w:sz w:val="24"/>
+          <w:szCs w:val="24"/>
+          <w:lang w:val="en-US"/>
+        </w:rPr>
+        <w:t>rentang</w:t>
+      </w:r>
+      <w:proofErr w:type="spellEnd"/>
+      <w:r>
+        <w:rPr>
+          <w:sz w:val="24"/>
+          <w:szCs w:val="24"/>
+          <w:lang w:val="en-US"/>
+        </w:rPr>
+        <w:t xml:space="preserve"> </w:t>
+      </w:r>
+      <w:proofErr w:type="spellStart"/>
+      <w:r>
+        <w:rPr>
+          <w:sz w:val="24"/>
+          <w:szCs w:val="24"/>
+          <w:lang w:val="en-US"/>
+        </w:rPr>
+        <w:t>pencapaian</w:t>
+      </w:r>
+      <w:proofErr w:type="spellEnd"/>
+      <w:r>
+        <w:rPr>
+          <w:sz w:val="24"/>
+          <w:szCs w:val="24"/>
+          <w:lang w:val="en-US"/>
+        </w:rPr>
+        <w:t xml:space="preserve"> target </w:t>
+      </w:r>
+      <w:proofErr w:type="spellStart"/>
+      <w:r>
+        <w:rPr>
+          <w:sz w:val="24"/>
+          <w:szCs w:val="24"/>
+          <w:lang w:val="en-US"/>
+        </w:rPr>
+        <w:t>penagihan</w:t>
+      </w:r>
+      <w:proofErr w:type="spellEnd"/>
+      <w:r>
+        <w:rPr>
+          <w:sz w:val="24"/>
+          <w:szCs w:val="24"/>
+          <w:lang w:val="en-US"/>
+        </w:rPr>
+        <w:t xml:space="preserve"> </w:t>
+      </w:r>
+      <w:proofErr w:type="spellStart"/>
+      <w:r>
+        <w:rPr>
+          <w:sz w:val="24"/>
+          <w:szCs w:val="24"/>
+          <w:lang w:val="en-US"/>
+        </w:rPr>
+        <w:t>piutang</w:t>
+      </w:r>
+      <w:proofErr w:type="spellEnd"/>
+      <w:r>
+        <w:rPr>
+          <w:sz w:val="24"/>
+          <w:szCs w:val="24"/>
+          <w:lang w:val="en-US"/>
+        </w:rPr>
+        <w:t xml:space="preserve"> (Collection).</w:t>
+      </w:r>
     </w:p>
     <w:p>
       <w:pPr>
@@ -10570,6 +11656,312 @@
           <w:lang w:val="en-US"/>
         </w:rPr>
         <w:t xml:space="preserve"> </w:t>
+      </w:r>
+      <w:proofErr w:type="spellStart"/>
+      <w:r>
+        <w:rPr>
+          <w:sz w:val="24"/>
+          <w:szCs w:val="24"/>
+          <w:lang w:val="en-US"/>
+        </w:rPr>
+        <w:t>Tampilan</w:t>
+      </w:r>
+      <w:proofErr w:type="spellEnd"/>
+      <w:r>
+        <w:rPr>
+          <w:sz w:val="24"/>
+          <w:szCs w:val="24"/>
+          <w:lang w:val="en-US"/>
+        </w:rPr>
+        <w:t xml:space="preserve"> </w:t>
+      </w:r>
+      <w:proofErr w:type="spellStart"/>
+      <w:r>
+        <w:rPr>
+          <w:sz w:val="24"/>
+          <w:szCs w:val="24"/>
+          <w:lang w:val="en-US"/>
+        </w:rPr>
+        <w:t>berupa</w:t>
+      </w:r>
+      <w:proofErr w:type="spellEnd"/>
+      <w:r>
+        <w:rPr>
+          <w:sz w:val="24"/>
+          <w:szCs w:val="24"/>
+          <w:lang w:val="en-US"/>
+        </w:rPr>
+        <w:t xml:space="preserve"> table </w:t>
+      </w:r>
+      <w:proofErr w:type="spellStart"/>
+      <w:r>
+        <w:rPr>
+          <w:sz w:val="24"/>
+          <w:szCs w:val="24"/>
+          <w:lang w:val="en-US"/>
+        </w:rPr>
+        <w:t>aturan</w:t>
+      </w:r>
+      <w:proofErr w:type="spellEnd"/>
+      <w:r>
+        <w:rPr>
+          <w:sz w:val="24"/>
+          <w:szCs w:val="24"/>
+          <w:lang w:val="en-US"/>
+        </w:rPr>
+        <w:t xml:space="preserve"> </w:t>
+      </w:r>
+      <w:proofErr w:type="spellStart"/>
+      <w:r>
+        <w:rPr>
+          <w:sz w:val="24"/>
+          <w:szCs w:val="24"/>
+          <w:lang w:val="en-US"/>
+        </w:rPr>
+        <w:t>skema</w:t>
+      </w:r>
+      <w:proofErr w:type="spellEnd"/>
+      <w:r>
+        <w:rPr>
+          <w:sz w:val="24"/>
+          <w:szCs w:val="24"/>
+          <w:lang w:val="en-US"/>
+        </w:rPr>
+        <w:t xml:space="preserve"> </w:t>
+      </w:r>
+      <w:proofErr w:type="spellStart"/>
+      <w:r>
+        <w:rPr>
+          <w:sz w:val="24"/>
+          <w:szCs w:val="24"/>
+          <w:lang w:val="en-US"/>
+        </w:rPr>
+        <w:t>indeks</w:t>
+      </w:r>
+      <w:proofErr w:type="spellEnd"/>
+      <w:r>
+        <w:rPr>
+          <w:sz w:val="24"/>
+          <w:szCs w:val="24"/>
+          <w:lang w:val="en-US"/>
+        </w:rPr>
+        <w:t xml:space="preserve"> </w:t>
+      </w:r>
+      <w:proofErr w:type="spellStart"/>
+      <w:r>
+        <w:rPr>
+          <w:sz w:val="24"/>
+          <w:szCs w:val="24"/>
+          <w:lang w:val="en-US"/>
+        </w:rPr>
+        <w:t>komisi</w:t>
+      </w:r>
+      <w:proofErr w:type="spellEnd"/>
+      <w:r>
+        <w:rPr>
+          <w:sz w:val="24"/>
+          <w:szCs w:val="24"/>
+          <w:lang w:val="en-US"/>
+        </w:rPr>
+        <w:t xml:space="preserve">. </w:t>
+      </w:r>
+      <w:proofErr w:type="spellStart"/>
+      <w:r>
+        <w:rPr>
+          <w:sz w:val="24"/>
+          <w:szCs w:val="24"/>
+          <w:lang w:val="en-US"/>
+        </w:rPr>
+        <w:t>Tombol</w:t>
+      </w:r>
+      <w:proofErr w:type="spellEnd"/>
+      <w:r>
+        <w:rPr>
+          <w:sz w:val="24"/>
+          <w:szCs w:val="24"/>
+          <w:lang w:val="en-US"/>
+        </w:rPr>
+        <w:t xml:space="preserve"> </w:t>
+      </w:r>
+      <w:proofErr w:type="spellStart"/>
+      <w:r>
+        <w:rPr>
+          <w:sz w:val="24"/>
+          <w:szCs w:val="24"/>
+          <w:lang w:val="en-US"/>
+        </w:rPr>
+        <w:t>Tambah</w:t>
+      </w:r>
+      <w:proofErr w:type="spellEnd"/>
+      <w:r>
+        <w:rPr>
+          <w:sz w:val="24"/>
+          <w:szCs w:val="24"/>
+          <w:lang w:val="en-US"/>
+        </w:rPr>
+        <w:t xml:space="preserve"> / Edit </w:t>
+      </w:r>
+      <w:proofErr w:type="spellStart"/>
+      <w:r>
+        <w:rPr>
+          <w:sz w:val="24"/>
+          <w:szCs w:val="24"/>
+          <w:lang w:val="en-US"/>
+        </w:rPr>
+        <w:t>memunculkan</w:t>
+      </w:r>
+      <w:proofErr w:type="spellEnd"/>
+      <w:r>
+        <w:rPr>
+          <w:sz w:val="24"/>
+          <w:szCs w:val="24"/>
+          <w:lang w:val="en-US"/>
+        </w:rPr>
+        <w:t xml:space="preserve"> Modal Form input </w:t>
+      </w:r>
+      <w:proofErr w:type="spellStart"/>
+      <w:r>
+        <w:rPr>
+          <w:sz w:val="24"/>
+          <w:szCs w:val="24"/>
+          <w:lang w:val="en-US"/>
+        </w:rPr>
+        <w:t>Tipe</w:t>
+      </w:r>
+      <w:proofErr w:type="spellEnd"/>
+      <w:r>
+        <w:rPr>
+          <w:sz w:val="24"/>
+          <w:szCs w:val="24"/>
+          <w:lang w:val="en-US"/>
+        </w:rPr>
+        <w:t xml:space="preserve"> Kategori, Nilai </w:t>
+      </w:r>
+      <w:proofErr w:type="spellStart"/>
+      <w:r>
+        <w:rPr>
+          <w:sz w:val="24"/>
+          <w:szCs w:val="24"/>
+          <w:lang w:val="en-US"/>
+        </w:rPr>
+        <w:t>Persentase</w:t>
+      </w:r>
+      <w:proofErr w:type="spellEnd"/>
+      <w:r>
+        <w:rPr>
+          <w:sz w:val="24"/>
+          <w:szCs w:val="24"/>
+          <w:lang w:val="en-US"/>
+        </w:rPr>
+        <w:t xml:space="preserve"> Minimal (Min), Nilai </w:t>
+      </w:r>
+      <w:proofErr w:type="spellStart"/>
+      <w:r>
+        <w:rPr>
+          <w:sz w:val="24"/>
+          <w:szCs w:val="24"/>
+          <w:lang w:val="en-US"/>
+        </w:rPr>
+        <w:t>Persentase</w:t>
+      </w:r>
+      <w:proofErr w:type="spellEnd"/>
+      <w:r>
+        <w:rPr>
+          <w:sz w:val="24"/>
+          <w:szCs w:val="24"/>
+          <w:lang w:val="en-US"/>
+        </w:rPr>
+        <w:t xml:space="preserve"> </w:t>
+      </w:r>
+      <w:proofErr w:type="spellStart"/>
+      <w:r>
+        <w:rPr>
+          <w:sz w:val="24"/>
+          <w:szCs w:val="24"/>
+          <w:lang w:val="en-US"/>
+        </w:rPr>
+        <w:t>Maksimal</w:t>
+      </w:r>
+      <w:proofErr w:type="spellEnd"/>
+      <w:r>
+        <w:rPr>
+          <w:sz w:val="24"/>
+          <w:szCs w:val="24"/>
+          <w:lang w:val="en-US"/>
+        </w:rPr>
+        <w:t xml:space="preserve"> (Max), </w:t>
+      </w:r>
+      <w:proofErr w:type="spellStart"/>
+      <w:r>
+        <w:rPr>
+          <w:sz w:val="24"/>
+          <w:szCs w:val="24"/>
+          <w:lang w:val="en-US"/>
+        </w:rPr>
+        <w:t>serta</w:t>
+      </w:r>
+      <w:proofErr w:type="spellEnd"/>
+      <w:r>
+        <w:rPr>
+          <w:sz w:val="24"/>
+          <w:szCs w:val="24"/>
+          <w:lang w:val="en-US"/>
+        </w:rPr>
+        <w:t xml:space="preserve"> </w:t>
+      </w:r>
+      <w:proofErr w:type="spellStart"/>
+      <w:r>
+        <w:rPr>
+          <w:sz w:val="24"/>
+          <w:szCs w:val="24"/>
+          <w:lang w:val="en-US"/>
+        </w:rPr>
+        <w:t>Bobot</w:t>
+      </w:r>
+      <w:proofErr w:type="spellEnd"/>
+      <w:r>
+        <w:rPr>
+          <w:sz w:val="24"/>
+          <w:szCs w:val="24"/>
+          <w:lang w:val="en-US"/>
+        </w:rPr>
+        <w:t xml:space="preserve"> Index Commission. Hapus </w:t>
+      </w:r>
+      <w:proofErr w:type="spellStart"/>
+      <w:r>
+        <w:rPr>
+          <w:sz w:val="24"/>
+          <w:szCs w:val="24"/>
+          <w:lang w:val="en-US"/>
+        </w:rPr>
+        <w:t>memunculkan</w:t>
+      </w:r>
+      <w:proofErr w:type="spellEnd"/>
+      <w:r>
+        <w:rPr>
+          <w:sz w:val="24"/>
+          <w:szCs w:val="24"/>
+          <w:lang w:val="en-US"/>
+        </w:rPr>
+        <w:t xml:space="preserve"> alert </w:t>
+      </w:r>
+      <w:proofErr w:type="spellStart"/>
+      <w:r>
+        <w:rPr>
+          <w:sz w:val="24"/>
+          <w:szCs w:val="24"/>
+          <w:lang w:val="en-US"/>
+        </w:rPr>
+        <w:t>konfirmasi</w:t>
+      </w:r>
+      <w:proofErr w:type="spellEnd"/>
+      <w:r>
+        <w:rPr>
+          <w:sz w:val="24"/>
+          <w:szCs w:val="24"/>
+          <w:lang w:val="en-US"/>
+        </w:rPr>
+        <w:t>.</w:t>
       </w:r>
     </w:p>
     <w:p/>
@@ -10614,8 +12006,9 @@
           <w:szCs w:val="24"/>
           <w:lang w:val="en-US"/>
         </w:rPr>
-        <w:t xml:space="preserve">Dashboard </w:t>
-      </w:r>
+        <w:t xml:space="preserve">Marketing </w:t>
+      </w:r>
+      <w:proofErr w:type="spellStart"/>
       <w:r>
         <w:rPr>
           <w:b/>
@@ -10624,31 +12017,44 @@
           <w:szCs w:val="24"/>
           <w:lang w:val="en-US"/>
         </w:rPr>
-        <w:t>Production Proses</w:t>
-      </w:r>
-      <w:r>
-        <w:rPr>
-          <w:sz w:val="24"/>
-          <w:szCs w:val="24"/>
-          <w:lang w:val="en-US"/>
-        </w:rPr>
-        <w:t xml:space="preserve"> `</w:t>
-      </w:r>
-      <w:r>
-        <w:rPr>
-          <w:sz w:val="24"/>
-          <w:szCs w:val="24"/>
-          <w:lang w:val="en-US"/>
-        </w:rPr>
-        <w:t>production-process-dashboard</w:t>
-      </w:r>
-      <w:r>
-        <w:rPr>
-          <w:sz w:val="24"/>
-          <w:szCs w:val="24"/>
-          <w:lang w:val="en-US"/>
-        </w:rPr>
-        <w:t>`</w:t>
+        <w:t>Komisi</w:t>
+      </w:r>
+      <w:proofErr w:type="spellEnd"/>
+      <w:r>
+        <w:rPr>
+          <w:b/>
+          <w:bCs/>
+          <w:sz w:val="24"/>
+          <w:szCs w:val="24"/>
+          <w:lang w:val="en-US"/>
+        </w:rPr>
+        <w:t xml:space="preserve"> Collection </w:t>
+      </w:r>
+      <w:r>
+        <w:rPr>
+          <w:sz w:val="24"/>
+          <w:szCs w:val="24"/>
+          <w:lang w:val="en-US"/>
+        </w:rPr>
+        <w:t>`marketing-</w:t>
+      </w:r>
+      <w:proofErr w:type="spellStart"/>
+      <w:r>
+        <w:rPr>
+          <w:sz w:val="24"/>
+          <w:szCs w:val="24"/>
+          <w:lang w:val="en-US"/>
+        </w:rPr>
+        <w:t>komisi</w:t>
+      </w:r>
+      <w:proofErr w:type="spellEnd"/>
+      <w:r>
+        <w:rPr>
+          <w:sz w:val="24"/>
+          <w:szCs w:val="24"/>
+          <w:lang w:val="en-US"/>
+        </w:rPr>
+        <w:t>-collection`</w:t>
       </w:r>
     </w:p>
     <w:p>
@@ -10695,6 +12101,213 @@
         </w:rPr>
         <w:t xml:space="preserve"> </w:t>
       </w:r>
+      <w:r>
+        <w:rPr>
+          <w:sz w:val="24"/>
+          <w:szCs w:val="24"/>
+          <w:lang w:val="en-US"/>
+        </w:rPr>
+        <w:t xml:space="preserve">TA, Marketing, Target </w:t>
+      </w:r>
+      <w:proofErr w:type="spellStart"/>
+      <w:r>
+        <w:rPr>
+          <w:sz w:val="24"/>
+          <w:szCs w:val="24"/>
+          <w:lang w:val="en-US"/>
+        </w:rPr>
+        <w:t>Usia</w:t>
+      </w:r>
+      <w:proofErr w:type="spellEnd"/>
+      <w:r>
+        <w:rPr>
+          <w:sz w:val="24"/>
+          <w:szCs w:val="24"/>
+          <w:lang w:val="en-US"/>
+        </w:rPr>
+        <w:t xml:space="preserve"> </w:t>
+      </w:r>
+      <w:proofErr w:type="spellStart"/>
+      <w:r>
+        <w:rPr>
+          <w:sz w:val="24"/>
+          <w:szCs w:val="24"/>
+          <w:lang w:val="en-US"/>
+        </w:rPr>
+        <w:t>Piutang</w:t>
+      </w:r>
+      <w:proofErr w:type="spellEnd"/>
+      <w:r>
+        <w:rPr>
+          <w:sz w:val="24"/>
+          <w:szCs w:val="24"/>
+          <w:lang w:val="en-US"/>
+        </w:rPr>
+        <w:t xml:space="preserve"> &gt; 90, </w:t>
+      </w:r>
+      <w:proofErr w:type="spellStart"/>
+      <w:r>
+        <w:rPr>
+          <w:sz w:val="24"/>
+          <w:szCs w:val="24"/>
+          <w:lang w:val="en-US"/>
+        </w:rPr>
+        <w:t>Pencapaian</w:t>
+      </w:r>
+      <w:proofErr w:type="spellEnd"/>
+      <w:r>
+        <w:rPr>
+          <w:sz w:val="24"/>
+          <w:szCs w:val="24"/>
+          <w:lang w:val="en-US"/>
+        </w:rPr>
+        <w:t xml:space="preserve">, </w:t>
+      </w:r>
+      <w:proofErr w:type="spellStart"/>
+      <w:r>
+        <w:rPr>
+          <w:sz w:val="24"/>
+          <w:szCs w:val="24"/>
+          <w:lang w:val="en-US"/>
+        </w:rPr>
+        <w:t>Persentase</w:t>
+      </w:r>
+      <w:proofErr w:type="spellEnd"/>
+      <w:r>
+        <w:rPr>
+          <w:sz w:val="24"/>
+          <w:szCs w:val="24"/>
+          <w:lang w:val="en-US"/>
+        </w:rPr>
+        <w:t xml:space="preserve">, Index Target &gt;= </w:t>
+      </w:r>
+      <w:r>
+        <w:rPr>
+          <w:sz w:val="24"/>
+          <w:szCs w:val="24"/>
+          <w:lang w:val="en-US"/>
+        </w:rPr>
+        <w:lastRenderedPageBreak/>
+        <w:t xml:space="preserve">30, </w:t>
+      </w:r>
+      <w:proofErr w:type="spellStart"/>
+      <w:r>
+        <w:rPr>
+          <w:sz w:val="24"/>
+          <w:szCs w:val="24"/>
+          <w:lang w:val="en-US"/>
+        </w:rPr>
+        <w:t>Komisi</w:t>
+      </w:r>
+      <w:proofErr w:type="spellEnd"/>
+      <w:r>
+        <w:rPr>
+          <w:sz w:val="24"/>
+          <w:szCs w:val="24"/>
+          <w:lang w:val="en-US"/>
+        </w:rPr>
+        <w:t xml:space="preserve">, Target </w:t>
+      </w:r>
+      <w:proofErr w:type="spellStart"/>
+      <w:r>
+        <w:rPr>
+          <w:sz w:val="24"/>
+          <w:szCs w:val="24"/>
+          <w:lang w:val="en-US"/>
+        </w:rPr>
+        <w:t>Usia</w:t>
+      </w:r>
+      <w:proofErr w:type="spellEnd"/>
+      <w:r>
+        <w:rPr>
+          <w:sz w:val="24"/>
+          <w:szCs w:val="24"/>
+          <w:lang w:val="en-US"/>
+        </w:rPr>
+        <w:t xml:space="preserve"> </w:t>
+      </w:r>
+      <w:proofErr w:type="spellStart"/>
+      <w:r>
+        <w:rPr>
+          <w:sz w:val="24"/>
+          <w:szCs w:val="24"/>
+          <w:lang w:val="en-US"/>
+        </w:rPr>
+        <w:t>Piutang</w:t>
+      </w:r>
+      <w:proofErr w:type="spellEnd"/>
+      <w:r>
+        <w:rPr>
+          <w:sz w:val="24"/>
+          <w:szCs w:val="24"/>
+          <w:lang w:val="en-US"/>
+        </w:rPr>
+        <w:t xml:space="preserve"> &lt;= 90, </w:t>
+      </w:r>
+      <w:proofErr w:type="spellStart"/>
+      <w:r>
+        <w:rPr>
+          <w:sz w:val="24"/>
+          <w:szCs w:val="24"/>
+          <w:lang w:val="en-US"/>
+        </w:rPr>
+        <w:t>Pencapaian</w:t>
+      </w:r>
+      <w:proofErr w:type="spellEnd"/>
+      <w:r>
+        <w:rPr>
+          <w:sz w:val="24"/>
+          <w:szCs w:val="24"/>
+          <w:lang w:val="en-US"/>
+        </w:rPr>
+        <w:t xml:space="preserve">, </w:t>
+      </w:r>
+      <w:proofErr w:type="spellStart"/>
+      <w:r>
+        <w:rPr>
+          <w:sz w:val="24"/>
+          <w:szCs w:val="24"/>
+          <w:lang w:val="en-US"/>
+        </w:rPr>
+        <w:t>Persentase</w:t>
+      </w:r>
+      <w:proofErr w:type="spellEnd"/>
+      <w:r>
+        <w:rPr>
+          <w:sz w:val="24"/>
+          <w:szCs w:val="24"/>
+          <w:lang w:val="en-US"/>
+        </w:rPr>
+        <w:t xml:space="preserve">, Index Target &gt;= 80, </w:t>
+      </w:r>
+      <w:proofErr w:type="spellStart"/>
+      <w:r>
+        <w:rPr>
+          <w:sz w:val="24"/>
+          <w:szCs w:val="24"/>
+          <w:lang w:val="en-US"/>
+        </w:rPr>
+        <w:t>Komisi</w:t>
+      </w:r>
+      <w:proofErr w:type="spellEnd"/>
+      <w:r>
+        <w:rPr>
+          <w:sz w:val="24"/>
+          <w:szCs w:val="24"/>
+          <w:lang w:val="en-US"/>
+        </w:rPr>
+        <w:t xml:space="preserve">, Total </w:t>
+      </w:r>
+      <w:proofErr w:type="spellStart"/>
+      <w:r>
+        <w:rPr>
+          <w:sz w:val="24"/>
+          <w:szCs w:val="24"/>
+          <w:lang w:val="en-US"/>
+        </w:rPr>
+        <w:t>Komisi</w:t>
+      </w:r>
+      <w:proofErr w:type="spellEnd"/>
     </w:p>
     <w:p>
       <w:pPr>
@@ -10742,6 +12355,276 @@
         </w:rPr>
         <w:t xml:space="preserve"> </w:t>
       </w:r>
+      <w:proofErr w:type="spellStart"/>
+      <w:r>
+        <w:rPr>
+          <w:sz w:val="24"/>
+          <w:szCs w:val="24"/>
+          <w:lang w:val="en-US"/>
+        </w:rPr>
+        <w:t>Mengkalkulasi</w:t>
+      </w:r>
+      <w:proofErr w:type="spellEnd"/>
+      <w:r>
+        <w:rPr>
+          <w:sz w:val="24"/>
+          <w:szCs w:val="24"/>
+          <w:lang w:val="en-US"/>
+        </w:rPr>
+        <w:t xml:space="preserve"> dan </w:t>
+      </w:r>
+      <w:proofErr w:type="spellStart"/>
+      <w:r>
+        <w:rPr>
+          <w:sz w:val="24"/>
+          <w:szCs w:val="24"/>
+          <w:lang w:val="en-US"/>
+        </w:rPr>
+        <w:t>memproses</w:t>
+      </w:r>
+      <w:proofErr w:type="spellEnd"/>
+      <w:r>
+        <w:rPr>
+          <w:sz w:val="24"/>
+          <w:szCs w:val="24"/>
+          <w:lang w:val="en-US"/>
+        </w:rPr>
+        <w:t xml:space="preserve"> </w:t>
+      </w:r>
+      <w:proofErr w:type="spellStart"/>
+      <w:r>
+        <w:rPr>
+          <w:sz w:val="24"/>
+          <w:szCs w:val="24"/>
+          <w:lang w:val="en-US"/>
+        </w:rPr>
+        <w:t>pencairan</w:t>
+      </w:r>
+      <w:proofErr w:type="spellEnd"/>
+      <w:r>
+        <w:rPr>
+          <w:sz w:val="24"/>
+          <w:szCs w:val="24"/>
+          <w:lang w:val="en-US"/>
+        </w:rPr>
+        <w:t xml:space="preserve"> </w:t>
+      </w:r>
+      <w:proofErr w:type="spellStart"/>
+      <w:r>
+        <w:rPr>
+          <w:sz w:val="24"/>
+          <w:szCs w:val="24"/>
+          <w:lang w:val="en-US"/>
+        </w:rPr>
+        <w:t>komisi</w:t>
+      </w:r>
+      <w:proofErr w:type="spellEnd"/>
+      <w:r>
+        <w:rPr>
+          <w:sz w:val="24"/>
+          <w:szCs w:val="24"/>
+          <w:lang w:val="en-US"/>
+        </w:rPr>
+        <w:t xml:space="preserve"> </w:t>
+      </w:r>
+      <w:proofErr w:type="spellStart"/>
+      <w:r>
+        <w:rPr>
+          <w:sz w:val="24"/>
+          <w:szCs w:val="24"/>
+          <w:lang w:val="en-US"/>
+        </w:rPr>
+        <w:t>penagihan</w:t>
+      </w:r>
+      <w:proofErr w:type="spellEnd"/>
+      <w:r>
+        <w:rPr>
+          <w:sz w:val="24"/>
+          <w:szCs w:val="24"/>
+          <w:lang w:val="en-US"/>
+        </w:rPr>
+        <w:t xml:space="preserve"> </w:t>
+      </w:r>
+      <w:proofErr w:type="spellStart"/>
+      <w:r>
+        <w:rPr>
+          <w:sz w:val="24"/>
+          <w:szCs w:val="24"/>
+          <w:lang w:val="en-US"/>
+        </w:rPr>
+        <w:t>bagi</w:t>
+      </w:r>
+      <w:proofErr w:type="spellEnd"/>
+      <w:r>
+        <w:rPr>
+          <w:sz w:val="24"/>
+          <w:szCs w:val="24"/>
+          <w:lang w:val="en-US"/>
+        </w:rPr>
+        <w:t xml:space="preserve"> </w:t>
+      </w:r>
+      <w:proofErr w:type="spellStart"/>
+      <w:r>
+        <w:rPr>
+          <w:sz w:val="24"/>
+          <w:szCs w:val="24"/>
+          <w:lang w:val="en-US"/>
+        </w:rPr>
+        <w:t>tim</w:t>
+      </w:r>
+      <w:proofErr w:type="spellEnd"/>
+      <w:r>
+        <w:rPr>
+          <w:sz w:val="24"/>
+          <w:szCs w:val="24"/>
+          <w:lang w:val="en-US"/>
+        </w:rPr>
+        <w:t xml:space="preserve"> marketing/sales </w:t>
+      </w:r>
+      <w:proofErr w:type="spellStart"/>
+      <w:r>
+        <w:rPr>
+          <w:sz w:val="24"/>
+          <w:szCs w:val="24"/>
+          <w:lang w:val="en-US"/>
+        </w:rPr>
+        <w:t>berdasarkan</w:t>
+      </w:r>
+      <w:proofErr w:type="spellEnd"/>
+      <w:r>
+        <w:rPr>
+          <w:sz w:val="24"/>
+          <w:szCs w:val="24"/>
+          <w:lang w:val="en-US"/>
+        </w:rPr>
+        <w:t xml:space="preserve"> </w:t>
+      </w:r>
+      <w:proofErr w:type="spellStart"/>
+      <w:r>
+        <w:rPr>
+          <w:sz w:val="24"/>
+          <w:szCs w:val="24"/>
+          <w:lang w:val="en-US"/>
+        </w:rPr>
+        <w:t>performa</w:t>
+      </w:r>
+      <w:proofErr w:type="spellEnd"/>
+      <w:r>
+        <w:rPr>
+          <w:sz w:val="24"/>
+          <w:szCs w:val="24"/>
+          <w:lang w:val="en-US"/>
+        </w:rPr>
+        <w:t xml:space="preserve"> </w:t>
+      </w:r>
+      <w:proofErr w:type="spellStart"/>
+      <w:r>
+        <w:rPr>
+          <w:sz w:val="24"/>
+          <w:szCs w:val="24"/>
+          <w:lang w:val="en-US"/>
+        </w:rPr>
+        <w:t>penagihan</w:t>
+      </w:r>
+      <w:proofErr w:type="spellEnd"/>
+      <w:r>
+        <w:rPr>
+          <w:sz w:val="24"/>
+          <w:szCs w:val="24"/>
+          <w:lang w:val="en-US"/>
+        </w:rPr>
+        <w:t xml:space="preserve"> </w:t>
+      </w:r>
+      <w:proofErr w:type="spellStart"/>
+      <w:r>
+        <w:rPr>
+          <w:sz w:val="24"/>
+          <w:szCs w:val="24"/>
+          <w:lang w:val="en-US"/>
+        </w:rPr>
+        <w:t>piutang</w:t>
+      </w:r>
+      <w:proofErr w:type="spellEnd"/>
+      <w:r>
+        <w:rPr>
+          <w:sz w:val="24"/>
+          <w:szCs w:val="24"/>
+          <w:lang w:val="en-US"/>
+        </w:rPr>
+        <w:t xml:space="preserve"> </w:t>
+      </w:r>
+      <w:proofErr w:type="spellStart"/>
+      <w:r>
+        <w:rPr>
+          <w:sz w:val="24"/>
+          <w:szCs w:val="24"/>
+          <w:lang w:val="en-US"/>
+        </w:rPr>
+        <w:t>lancar</w:t>
+      </w:r>
+      <w:proofErr w:type="spellEnd"/>
+      <w:r>
+        <w:rPr>
+          <w:sz w:val="24"/>
+          <w:szCs w:val="24"/>
+          <w:lang w:val="en-US"/>
+        </w:rPr>
+        <w:t xml:space="preserve"> (&lt;=90 </w:t>
+      </w:r>
+      <w:proofErr w:type="spellStart"/>
+      <w:r>
+        <w:rPr>
+          <w:sz w:val="24"/>
+          <w:szCs w:val="24"/>
+          <w:lang w:val="en-US"/>
+        </w:rPr>
+        <w:t>hari</w:t>
+      </w:r>
+      <w:proofErr w:type="spellEnd"/>
+      <w:r>
+        <w:rPr>
+          <w:sz w:val="24"/>
+          <w:szCs w:val="24"/>
+          <w:lang w:val="en-US"/>
+        </w:rPr>
+        <w:t xml:space="preserve">) dan </w:t>
+      </w:r>
+      <w:proofErr w:type="spellStart"/>
+      <w:r>
+        <w:rPr>
+          <w:sz w:val="24"/>
+          <w:szCs w:val="24"/>
+          <w:lang w:val="en-US"/>
+        </w:rPr>
+        <w:t>piutang</w:t>
+      </w:r>
+      <w:proofErr w:type="spellEnd"/>
+      <w:r>
+        <w:rPr>
+          <w:sz w:val="24"/>
+          <w:szCs w:val="24"/>
+          <w:lang w:val="en-US"/>
+        </w:rPr>
+        <w:t xml:space="preserve"> lama (&gt;90 </w:t>
+      </w:r>
+      <w:proofErr w:type="spellStart"/>
+      <w:r>
+        <w:rPr>
+          <w:sz w:val="24"/>
+          <w:szCs w:val="24"/>
+          <w:lang w:val="en-US"/>
+        </w:rPr>
+        <w:t>hari</w:t>
+      </w:r>
+      <w:proofErr w:type="spellEnd"/>
+      <w:r>
+        <w:rPr>
+          <w:sz w:val="24"/>
+          <w:szCs w:val="24"/>
+          <w:lang w:val="en-US"/>
+        </w:rPr>
+        <w:t>).</w:t>
+      </w:r>
     </w:p>
     <w:p>
       <w:pPr>
@@ -10788,6 +12671,492 @@
           <w:lang w:val="en-US"/>
         </w:rPr>
         <w:t xml:space="preserve"> </w:t>
+      </w:r>
+      <w:proofErr w:type="spellStart"/>
+      <w:r>
+        <w:rPr>
+          <w:sz w:val="24"/>
+          <w:szCs w:val="24"/>
+          <w:lang w:val="en-US"/>
+        </w:rPr>
+        <w:t>Tampilan</w:t>
+      </w:r>
+      <w:proofErr w:type="spellEnd"/>
+      <w:r>
+        <w:rPr>
+          <w:sz w:val="24"/>
+          <w:szCs w:val="24"/>
+          <w:lang w:val="en-US"/>
+        </w:rPr>
+        <w:t xml:space="preserve"> </w:t>
+      </w:r>
+      <w:proofErr w:type="spellStart"/>
+      <w:r>
+        <w:rPr>
+          <w:sz w:val="24"/>
+          <w:szCs w:val="24"/>
+          <w:lang w:val="en-US"/>
+        </w:rPr>
+        <w:t>awal</w:t>
+      </w:r>
+      <w:proofErr w:type="spellEnd"/>
+      <w:r>
+        <w:rPr>
+          <w:sz w:val="24"/>
+          <w:szCs w:val="24"/>
+          <w:lang w:val="en-US"/>
+        </w:rPr>
+        <w:t xml:space="preserve"> </w:t>
+      </w:r>
+      <w:proofErr w:type="spellStart"/>
+      <w:r>
+        <w:rPr>
+          <w:sz w:val="24"/>
+          <w:szCs w:val="24"/>
+          <w:lang w:val="en-US"/>
+        </w:rPr>
+        <w:t>berupa</w:t>
+      </w:r>
+      <w:proofErr w:type="spellEnd"/>
+      <w:r>
+        <w:rPr>
+          <w:sz w:val="24"/>
+          <w:szCs w:val="24"/>
+          <w:lang w:val="en-US"/>
+        </w:rPr>
+        <w:t xml:space="preserve"> table </w:t>
+      </w:r>
+      <w:proofErr w:type="spellStart"/>
+      <w:r>
+        <w:rPr>
+          <w:sz w:val="24"/>
+          <w:szCs w:val="24"/>
+          <w:lang w:val="en-US"/>
+        </w:rPr>
+        <w:t>kalkulasi</w:t>
+      </w:r>
+      <w:proofErr w:type="spellEnd"/>
+      <w:r>
+        <w:rPr>
+          <w:sz w:val="24"/>
+          <w:szCs w:val="24"/>
+          <w:lang w:val="en-US"/>
+        </w:rPr>
+        <w:t xml:space="preserve"> </w:t>
+      </w:r>
+      <w:proofErr w:type="spellStart"/>
+      <w:r>
+        <w:rPr>
+          <w:sz w:val="24"/>
+          <w:szCs w:val="24"/>
+          <w:lang w:val="en-US"/>
+        </w:rPr>
+        <w:t>komisi</w:t>
+      </w:r>
+      <w:proofErr w:type="spellEnd"/>
+      <w:r>
+        <w:rPr>
+          <w:sz w:val="24"/>
+          <w:szCs w:val="24"/>
+          <w:lang w:val="en-US"/>
+        </w:rPr>
+        <w:t xml:space="preserve"> </w:t>
+      </w:r>
+      <w:proofErr w:type="spellStart"/>
+      <w:r>
+        <w:rPr>
+          <w:sz w:val="24"/>
+          <w:szCs w:val="24"/>
+          <w:lang w:val="en-US"/>
+        </w:rPr>
+        <w:t>bulanan</w:t>
+      </w:r>
+      <w:proofErr w:type="spellEnd"/>
+      <w:r>
+        <w:rPr>
+          <w:sz w:val="24"/>
+          <w:szCs w:val="24"/>
+          <w:lang w:val="en-US"/>
+        </w:rPr>
+        <w:t xml:space="preserve"> per salesman. </w:t>
+      </w:r>
+      <w:proofErr w:type="spellStart"/>
+      <w:r>
+        <w:rPr>
+          <w:sz w:val="24"/>
+          <w:szCs w:val="24"/>
+          <w:lang w:val="en-US"/>
+        </w:rPr>
+        <w:t>Tombol</w:t>
+      </w:r>
+      <w:proofErr w:type="spellEnd"/>
+      <w:r>
+        <w:rPr>
+          <w:sz w:val="24"/>
+          <w:szCs w:val="24"/>
+          <w:lang w:val="en-US"/>
+        </w:rPr>
+        <w:t xml:space="preserve"> </w:t>
+      </w:r>
+      <w:proofErr w:type="spellStart"/>
+      <w:r>
+        <w:rPr>
+          <w:sz w:val="24"/>
+          <w:szCs w:val="24"/>
+          <w:lang w:val="en-US"/>
+        </w:rPr>
+        <w:t>Tambah</w:t>
+      </w:r>
+      <w:proofErr w:type="spellEnd"/>
+      <w:r>
+        <w:rPr>
+          <w:sz w:val="24"/>
+          <w:szCs w:val="24"/>
+          <w:lang w:val="en-US"/>
+        </w:rPr>
+        <w:t xml:space="preserve"> / </w:t>
+      </w:r>
+      <w:proofErr w:type="spellStart"/>
+      <w:r>
+        <w:rPr>
+          <w:sz w:val="24"/>
+          <w:szCs w:val="24"/>
+          <w:lang w:val="en-US"/>
+        </w:rPr>
+        <w:t>Hitung</w:t>
+      </w:r>
+      <w:proofErr w:type="spellEnd"/>
+      <w:r>
+        <w:rPr>
+          <w:sz w:val="24"/>
+          <w:szCs w:val="24"/>
+          <w:lang w:val="en-US"/>
+        </w:rPr>
+        <w:t xml:space="preserve"> </w:t>
+      </w:r>
+      <w:proofErr w:type="spellStart"/>
+      <w:r>
+        <w:rPr>
+          <w:sz w:val="24"/>
+          <w:szCs w:val="24"/>
+          <w:lang w:val="en-US"/>
+        </w:rPr>
+        <w:t>Komisi</w:t>
+      </w:r>
+      <w:proofErr w:type="spellEnd"/>
+      <w:r>
+        <w:rPr>
+          <w:sz w:val="24"/>
+          <w:szCs w:val="24"/>
+          <w:lang w:val="en-US"/>
+        </w:rPr>
+        <w:t xml:space="preserve"> </w:t>
+      </w:r>
+      <w:proofErr w:type="spellStart"/>
+      <w:r>
+        <w:rPr>
+          <w:sz w:val="24"/>
+          <w:szCs w:val="24"/>
+          <w:lang w:val="en-US"/>
+        </w:rPr>
+        <w:t>memunculkan</w:t>
+      </w:r>
+      <w:proofErr w:type="spellEnd"/>
+      <w:r>
+        <w:rPr>
+          <w:sz w:val="24"/>
+          <w:szCs w:val="24"/>
+          <w:lang w:val="en-US"/>
+        </w:rPr>
+        <w:t xml:space="preserve"> Modal Form </w:t>
+      </w:r>
+      <w:proofErr w:type="spellStart"/>
+      <w:r>
+        <w:rPr>
+          <w:sz w:val="24"/>
+          <w:szCs w:val="24"/>
+          <w:lang w:val="en-US"/>
+        </w:rPr>
+        <w:t>berstruktur</w:t>
+      </w:r>
+      <w:proofErr w:type="spellEnd"/>
+      <w:r>
+        <w:rPr>
+          <w:sz w:val="24"/>
+          <w:szCs w:val="24"/>
+          <w:lang w:val="en-US"/>
+        </w:rPr>
+        <w:t xml:space="preserve"> </w:t>
+      </w:r>
+      <w:proofErr w:type="spellStart"/>
+      <w:r>
+        <w:rPr>
+          <w:sz w:val="24"/>
+          <w:szCs w:val="24"/>
+          <w:lang w:val="en-US"/>
+        </w:rPr>
+        <w:t>Pilihan</w:t>
+      </w:r>
+      <w:proofErr w:type="spellEnd"/>
+      <w:r>
+        <w:rPr>
+          <w:sz w:val="24"/>
+          <w:szCs w:val="24"/>
+          <w:lang w:val="en-US"/>
+        </w:rPr>
+        <w:t xml:space="preserve"> </w:t>
+      </w:r>
+      <w:proofErr w:type="spellStart"/>
+      <w:r>
+        <w:rPr>
+          <w:sz w:val="24"/>
+          <w:szCs w:val="24"/>
+          <w:lang w:val="en-US"/>
+        </w:rPr>
+        <w:t>Periode</w:t>
+      </w:r>
+      <w:proofErr w:type="spellEnd"/>
+      <w:r>
+        <w:rPr>
+          <w:sz w:val="24"/>
+          <w:szCs w:val="24"/>
+          <w:lang w:val="en-US"/>
+        </w:rPr>
+        <w:t xml:space="preserve">, Transit Area (TA), Lookup Marketing, </w:t>
+      </w:r>
+      <w:proofErr w:type="spellStart"/>
+      <w:r>
+        <w:rPr>
+          <w:sz w:val="24"/>
+          <w:szCs w:val="24"/>
+          <w:lang w:val="en-US"/>
+        </w:rPr>
+        <w:t>serta</w:t>
+      </w:r>
+      <w:proofErr w:type="spellEnd"/>
+      <w:r>
+        <w:rPr>
+          <w:sz w:val="24"/>
+          <w:szCs w:val="24"/>
+          <w:lang w:val="en-US"/>
+        </w:rPr>
+        <w:t xml:space="preserve"> data grid </w:t>
+      </w:r>
+      <w:proofErr w:type="spellStart"/>
+      <w:r>
+        <w:rPr>
+          <w:sz w:val="24"/>
+          <w:szCs w:val="24"/>
+          <w:lang w:val="en-US"/>
+        </w:rPr>
+        <w:t>kalkulasi</w:t>
+      </w:r>
+      <w:proofErr w:type="spellEnd"/>
+      <w:r>
+        <w:rPr>
+          <w:sz w:val="24"/>
+          <w:szCs w:val="24"/>
+          <w:lang w:val="en-US"/>
+        </w:rPr>
+        <w:t xml:space="preserve"> </w:t>
+      </w:r>
+      <w:proofErr w:type="spellStart"/>
+      <w:r>
+        <w:rPr>
+          <w:sz w:val="24"/>
+          <w:szCs w:val="24"/>
+          <w:lang w:val="en-US"/>
+        </w:rPr>
+        <w:t>otomatis</w:t>
+      </w:r>
+      <w:proofErr w:type="spellEnd"/>
+      <w:r>
+        <w:rPr>
+          <w:sz w:val="24"/>
+          <w:szCs w:val="24"/>
+          <w:lang w:val="en-US"/>
+        </w:rPr>
+        <w:t xml:space="preserve"> yang </w:t>
+      </w:r>
+      <w:proofErr w:type="spellStart"/>
+      <w:r>
+        <w:rPr>
+          <w:sz w:val="24"/>
+          <w:szCs w:val="24"/>
+          <w:lang w:val="en-US"/>
+        </w:rPr>
+        <w:t>membandingkan</w:t>
+      </w:r>
+      <w:proofErr w:type="spellEnd"/>
+      <w:r>
+        <w:rPr>
+          <w:sz w:val="24"/>
+          <w:szCs w:val="24"/>
+          <w:lang w:val="en-US"/>
+        </w:rPr>
+        <w:t xml:space="preserve"> target vs </w:t>
+      </w:r>
+      <w:proofErr w:type="spellStart"/>
+      <w:r>
+        <w:rPr>
+          <w:sz w:val="24"/>
+          <w:szCs w:val="24"/>
+          <w:lang w:val="en-US"/>
+        </w:rPr>
+        <w:t>pencapaian</w:t>
+      </w:r>
+      <w:proofErr w:type="spellEnd"/>
+      <w:r>
+        <w:rPr>
+          <w:sz w:val="24"/>
+          <w:szCs w:val="24"/>
+          <w:lang w:val="en-US"/>
+        </w:rPr>
+        <w:t xml:space="preserve"> </w:t>
+      </w:r>
+      <w:proofErr w:type="spellStart"/>
+      <w:r>
+        <w:rPr>
+          <w:sz w:val="24"/>
+          <w:szCs w:val="24"/>
+          <w:lang w:val="en-US"/>
+        </w:rPr>
+        <w:t>piutang</w:t>
+      </w:r>
+      <w:proofErr w:type="spellEnd"/>
+      <w:r>
+        <w:rPr>
+          <w:sz w:val="24"/>
+          <w:szCs w:val="24"/>
+          <w:lang w:val="en-US"/>
+        </w:rPr>
+        <w:t xml:space="preserve">, </w:t>
+      </w:r>
+      <w:proofErr w:type="spellStart"/>
+      <w:r>
+        <w:rPr>
+          <w:sz w:val="24"/>
+          <w:szCs w:val="24"/>
+          <w:lang w:val="en-US"/>
+        </w:rPr>
+        <w:t>penetapan</w:t>
+      </w:r>
+      <w:proofErr w:type="spellEnd"/>
+      <w:r>
+        <w:rPr>
+          <w:sz w:val="24"/>
+          <w:szCs w:val="24"/>
+          <w:lang w:val="en-US"/>
+        </w:rPr>
+        <w:t xml:space="preserve"> </w:t>
+      </w:r>
+      <w:proofErr w:type="spellStart"/>
+      <w:r>
+        <w:rPr>
+          <w:sz w:val="24"/>
+          <w:szCs w:val="24"/>
+          <w:lang w:val="en-US"/>
+        </w:rPr>
+        <w:t>indeks</w:t>
+      </w:r>
+      <w:proofErr w:type="spellEnd"/>
+      <w:r>
+        <w:rPr>
+          <w:sz w:val="24"/>
+          <w:szCs w:val="24"/>
+          <w:lang w:val="en-US"/>
+        </w:rPr>
+        <w:t xml:space="preserve">, dan total </w:t>
+      </w:r>
+      <w:proofErr w:type="spellStart"/>
+      <w:r>
+        <w:rPr>
+          <w:sz w:val="24"/>
+          <w:szCs w:val="24"/>
+          <w:lang w:val="en-US"/>
+        </w:rPr>
+        <w:t>nilai</w:t>
+      </w:r>
+      <w:proofErr w:type="spellEnd"/>
+      <w:r>
+        <w:rPr>
+          <w:sz w:val="24"/>
+          <w:szCs w:val="24"/>
+          <w:lang w:val="en-US"/>
+        </w:rPr>
+        <w:t xml:space="preserve"> </w:t>
+      </w:r>
+      <w:proofErr w:type="spellStart"/>
+      <w:r>
+        <w:rPr>
+          <w:sz w:val="24"/>
+          <w:szCs w:val="24"/>
+          <w:lang w:val="en-US"/>
+        </w:rPr>
+        <w:t>komisi</w:t>
+      </w:r>
+      <w:proofErr w:type="spellEnd"/>
+      <w:r>
+        <w:rPr>
+          <w:sz w:val="24"/>
+          <w:szCs w:val="24"/>
+          <w:lang w:val="en-US"/>
+        </w:rPr>
+        <w:t xml:space="preserve"> </w:t>
+      </w:r>
+      <w:proofErr w:type="spellStart"/>
+      <w:r>
+        <w:rPr>
+          <w:sz w:val="24"/>
+          <w:szCs w:val="24"/>
+          <w:lang w:val="en-US"/>
+        </w:rPr>
+        <w:t>bersih</w:t>
+      </w:r>
+      <w:proofErr w:type="spellEnd"/>
+      <w:r>
+        <w:rPr>
+          <w:sz w:val="24"/>
+          <w:szCs w:val="24"/>
+          <w:lang w:val="en-US"/>
+        </w:rPr>
+        <w:t xml:space="preserve"> yang </w:t>
+      </w:r>
+      <w:proofErr w:type="spellStart"/>
+      <w:r>
+        <w:rPr>
+          <w:sz w:val="24"/>
+          <w:szCs w:val="24"/>
+          <w:lang w:val="en-US"/>
+        </w:rPr>
+        <w:t>berhak</w:t>
+      </w:r>
+      <w:proofErr w:type="spellEnd"/>
+      <w:r>
+        <w:rPr>
+          <w:sz w:val="24"/>
+          <w:szCs w:val="24"/>
+          <w:lang w:val="en-US"/>
+        </w:rPr>
+        <w:t xml:space="preserve"> </w:t>
+      </w:r>
+      <w:proofErr w:type="spellStart"/>
+      <w:r>
+        <w:rPr>
+          <w:sz w:val="24"/>
+          <w:szCs w:val="24"/>
+          <w:lang w:val="en-US"/>
+        </w:rPr>
+        <w:t>diterima</w:t>
+      </w:r>
+      <w:proofErr w:type="spellEnd"/>
+      <w:r>
+        <w:rPr>
+          <w:sz w:val="24"/>
+          <w:szCs w:val="24"/>
+          <w:lang w:val="en-US"/>
+        </w:rPr>
+        <w:t>.</w:t>
       </w:r>
     </w:p>
     <w:p>

</xml_diff>